<commit_message>
Rebrand IWS welcome packs to match the IWS logo and invoice style
Use the IWS logo, navy and orange palette and Inter font from the IWS tax
invoice template, and fill in the real ABN, address, email, phone, GST and
weekly invoicing details.

Co-Authored-By: Claude Opus 5.5 <noreply@anthropic.com>
Claude-Session: https://claude.ai/code/session_01A6kxumer2vcdYiBuMTwi8c
</commit_message>
<xml_diff>
--- a/iws-welcome-packs/IWS_Welcome_Pack_Contractors_and_Support_Workers.docx
+++ b/iws-welcome-packs/IWS_Welcome_Pack_Contractors_and_Support_Workers.docx
@@ -17,93 +17,53 @@
         <w:tblLayout w:type="fixed"/>
       </w:tblPr>
       <w:tblGrid>
-        <w:gridCol w:w="9639"/>
+        <w:gridCol w:w="7030"/>
+        <w:gridCol w:w="2608"/>
       </w:tblGrid>
       <w:tr>
         <w:tc>
           <w:tcPr>
-            <w:tcW w:type="dxa" w:w="9638"/>
-            <w:shd w:val="clear" w:color="auto" w:fill="16325C"/>
+            <w:tcW w:type="dxa" w:w="7030"/>
+            <w:shd w:val="clear" w:color="auto" w:fill="1E3A5F"/>
             <w:tcMar>
-              <w:top w:w="500" w:type="dxa"/>
-              <w:bottom w:w="500" w:type="dxa"/>
-              <w:start w:w="500" w:type="dxa"/>
-              <w:end w:w="500" w:type="dxa"/>
+              <w:top w:w="0" w:type="dxa"/>
+              <w:bottom w:w="0" w:type="dxa"/>
+              <w:start w:w="0" w:type="dxa"/>
+              <w:end w:w="0" w:type="dxa"/>
             </w:tcMar>
           </w:tcPr>
           <w:p>
-            <w:r>
-              <w:rPr>
-                <w:b/>
-                <w:color w:val="FFFFFF"/>
-                <w:sz w:val="108"/>
-              </w:rPr>
-              <w:t>IWS</w:t>
-            </w:r>
-            <w:r>
-              <w:rPr>
-                <w:color w:val="F2A900"/>
-                <w:sz w:val="60"/>
-              </w:rPr>
-              <w:t xml:space="preserve">  ●</w:t>
-            </w:r>
-          </w:p>
-          <w:p>
-            <w:r>
-              <w:rPr>
-                <w:b/>
-                <w:color w:val="BFD8E6"/>
-                <w:sz w:val="22"/>
-                <w:spacing w:val="40"/>
-              </w:rPr>
-              <w:t>INTERACTIVE WORKFORCE SOLUTIONS</w:t>
-            </w:r>
-          </w:p>
-          <w:p/>
-          <w:p/>
-          <w:p/>
-          <w:p/>
-          <w:p/>
-          <w:p/>
-          <w:p/>
-          <w:p>
-            <w:r>
-              <w:rPr>
-                <w:b/>
-                <w:color w:val="F2A900"/>
-                <w:sz w:val="22"/>
-              </w:rPr>
-              <w:t>WELCOME TO THE TEAM</w:t>
-            </w:r>
-          </w:p>
-          <w:p>
             <w:pPr>
-              <w:spacing w:line="240" w:lineRule="auto"/>
+              <w:spacing w:after="0" w:line="100" w:lineRule="exact"/>
             </w:pPr>
             <w:r>
               <w:rPr>
-                <w:b/>
-                <w:color w:val="FFFFFF"/>
-                <w:sz w:val="76"/>
+                <w:sz w:val="2"/>
               </w:rPr>
-              <w:t>Contractor and Support Worker Welcome Pack</w:t>
             </w:r>
           </w:p>
+        </w:tc>
+        <w:tc>
+          <w:tcPr>
+            <w:tcW w:type="dxa" w:w="2608"/>
+            <w:shd w:val="clear" w:color="auto" w:fill="E07A2E"/>
+            <w:tcMar>
+              <w:top w:w="0" w:type="dxa"/>
+              <w:bottom w:w="0" w:type="dxa"/>
+              <w:start w:w="0" w:type="dxa"/>
+              <w:end w:w="0" w:type="dxa"/>
+            </w:tcMar>
+          </w:tcPr>
           <w:p>
+            <w:pPr>
+              <w:spacing w:after="0" w:line="100" w:lineRule="exact"/>
+            </w:pPr>
             <w:r>
               <w:rPr>
-                <w:color w:val="D6E4EC"/>
-                <w:sz w:val="28"/>
+                <w:sz w:val="2"/>
               </w:rPr>
-              <w:t>Everything you need before, during and after your first shift with IWS.</w:t>
             </w:r>
           </w:p>
-          <w:p/>
-          <w:p/>
-          <w:p/>
-          <w:p/>
-          <w:p/>
-          <w:p/>
         </w:tc>
       </w:tr>
     </w:tbl>
@@ -122,35 +82,254 @@
         <w:tblLayout w:type="fixed"/>
       </w:tblPr>
       <w:tblGrid>
+        <w:gridCol w:w="2551"/>
+        <w:gridCol w:w="7087"/>
+      </w:tblGrid>
+      <w:tr>
+        <w:tc>
+          <w:tcPr>
+            <w:tcW w:type="dxa" w:w="2551"/>
+            <w:tcMar>
+              <w:top w:w="400" w:type="dxa"/>
+              <w:bottom w:w="0" w:type="dxa"/>
+              <w:start w:w="0" w:type="dxa"/>
+              <w:end w:w="0" w:type="dxa"/>
+            </w:tcMar>
+          </w:tcPr>
+          <w:p>
+            <w:r>
+              <w:drawing>
+                <wp:inline xmlns:a="http://schemas.openxmlformats.org/drawingml/2006/main" xmlns:pic="http://schemas.openxmlformats.org/drawingml/2006/picture">
+                  <wp:extent cx="1224000" cy="1201228"/>
+                  <wp:docPr id="1" name="Picture 1"/>
+                  <wp:cNvGraphicFramePr>
+                    <a:graphicFrameLocks noChangeAspect="1"/>
+                  </wp:cNvGraphicFramePr>
+                  <a:graphic>
+                    <a:graphicData uri="http://schemas.openxmlformats.org/drawingml/2006/picture">
+                      <pic:pic>
+                        <pic:nvPicPr>
+                          <pic:cNvPr id="0" name="iws_logo.png"/>
+                          <pic:cNvPicPr/>
+                        </pic:nvPicPr>
+                        <pic:blipFill>
+                          <a:blip r:embed="rId9"/>
+                          <a:stretch>
+                            <a:fillRect/>
+                          </a:stretch>
+                        </pic:blipFill>
+                        <pic:spPr>
+                          <a:xfrm>
+                            <a:off x="0" y="0"/>
+                            <a:ext cx="1224000" cy="1201228"/>
+                          </a:xfrm>
+                          <a:prstGeom prst="rect"/>
+                        </pic:spPr>
+                      </pic:pic>
+                    </a:graphicData>
+                  </a:graphic>
+                </wp:inline>
+              </w:drawing>
+            </w:r>
+          </w:p>
+        </w:tc>
+        <w:tc>
+          <w:tcPr>
+            <w:tcW w:type="dxa" w:w="7087"/>
+            <w:tcMar>
+              <w:top w:w="400" w:type="dxa"/>
+              <w:bottom w:w="0" w:type="dxa"/>
+              <w:start w:w="0" w:type="dxa"/>
+              <w:end w:w="0" w:type="dxa"/>
+            </w:tcMar>
+          </w:tcPr>
+          <w:p>
+            <w:pPr>
+              <w:jc w:val="right"/>
+            </w:pPr>
+            <w:r>
+              <w:rPr>
+                <w:b/>
+                <w:color w:val="1E3A5F"/>
+                <w:sz w:val="30"/>
+              </w:rPr>
+              <w:t>Interactive Workforce Solutions</w:t>
+            </w:r>
+          </w:p>
+          <w:p>
+            <w:pPr>
+              <w:spacing w:after="20"/>
+              <w:jc w:val="right"/>
+            </w:pPr>
+            <w:r>
+              <w:rPr>
+                <w:color w:val="5B6770"/>
+                <w:sz w:val="19"/>
+              </w:rPr>
+              <w:t>2 Butterleaf Way, North Kellyville NSW 2155</w:t>
+            </w:r>
+          </w:p>
+          <w:p>
+            <w:pPr>
+              <w:spacing w:after="20"/>
+              <w:jc w:val="right"/>
+            </w:pPr>
+            <w:r>
+              <w:rPr>
+                <w:color w:val="5B6770"/>
+                <w:sz w:val="19"/>
+              </w:rPr>
+              <w:t>ABN 15 373 790 652</w:t>
+            </w:r>
+          </w:p>
+          <w:p>
+            <w:pPr>
+              <w:spacing w:after="20"/>
+              <w:jc w:val="right"/>
+            </w:pPr>
+            <w:r>
+              <w:rPr>
+                <w:color w:val="5B6770"/>
+                <w:sz w:val="19"/>
+              </w:rPr>
+              <w:t>michael.sibanda@interactivews.com  ·  +61 493 716 007</w:t>
+            </w:r>
+          </w:p>
+        </w:tc>
+      </w:tr>
+    </w:tbl>
+    <w:p/>
+    <w:p/>
+    <w:p/>
+    <w:p/>
+    <w:p/>
+    <w:p/>
+    <w:tbl>
+      <w:tblPr>
+        <w:tblLook w:firstColumn="1" w:firstRow="1" w:lastColumn="0" w:lastRow="0" w:noHBand="0" w:noVBand="1" w:val="04A0"/>
+        <w:tblBorders>
+          <w:top w:val="nil" w:sz="0" w:color="FFFFFF"/>
+          <w:left w:val="nil" w:sz="0" w:color="FFFFFF"/>
+          <w:bottom w:val="nil" w:sz="0" w:color="FFFFFF"/>
+          <w:right w:val="nil" w:sz="0" w:color="FFFFFF"/>
+          <w:insideH w:val="nil"/>
+          <w:insideV w:val="nil"/>
+        </w:tblBorders>
+        <w:tblW w:w="3515" w:type="dxa"/>
+        <w:tblLayout w:type="fixed"/>
+      </w:tblPr>
+      <w:tblGrid>
+        <w:gridCol w:w="3515"/>
+      </w:tblGrid>
+      <w:tr>
+        <w:tc>
+          <w:tcPr>
+            <w:tcW w:type="dxa" w:w="3515"/>
+            <w:shd w:val="clear" w:color="auto" w:fill="FDF1E7"/>
+            <w:tcMar>
+              <w:top w:w="60" w:type="dxa"/>
+              <w:bottom w:w="60" w:type="dxa"/>
+              <w:start w:w="180" w:type="dxa"/>
+              <w:end w:w="180" w:type="dxa"/>
+            </w:tcMar>
+          </w:tcPr>
+          <w:p>
+            <w:pPr>
+              <w:spacing w:after="0"/>
+            </w:pPr>
+            <w:r>
+              <w:rPr>
+                <w:b/>
+                <w:color w:val="C07034"/>
+                <w:sz w:val="21"/>
+              </w:rPr>
+              <w:t>Welcome to the team</w:t>
+            </w:r>
+          </w:p>
+        </w:tc>
+      </w:tr>
+    </w:tbl>
+    <w:p>
+      <w:pPr>
+        <w:spacing w:before="200" w:line="240" w:lineRule="auto"/>
+      </w:pPr>
+      <w:r>
+        <w:rPr>
+          <w:b/>
+          <w:color w:val="1E3A5F"/>
+          <w:sz w:val="80"/>
+        </w:rPr>
+        <w:t>Contractor and Support Worker Welcome Pack</w:t>
+      </w:r>
+    </w:p>
+    <w:p>
+      <w:r>
+        <w:rPr>
+          <w:color w:val="5B6770"/>
+          <w:sz w:val="28"/>
+        </w:rPr>
+        <w:t>Everything you need before, during and after your first shift with IWS.</w:t>
+      </w:r>
+    </w:p>
+    <w:p/>
+    <w:p/>
+    <w:p/>
+    <w:p/>
+    <w:p/>
+    <w:p/>
+    <w:p/>
+    <w:p/>
+    <w:p/>
+    <w:p/>
+    <w:p/>
+    <w:tbl>
+      <w:tblPr>
+        <w:tblLook w:firstColumn="1" w:firstRow="1" w:lastColumn="0" w:lastRow="0" w:noHBand="0" w:noVBand="1" w:val="04A0"/>
+        <w:tblBorders>
+          <w:top w:val="nil" w:sz="0" w:color="FFFFFF"/>
+          <w:left w:val="nil" w:sz="0" w:color="FFFFFF"/>
+          <w:bottom w:val="nil" w:sz="0" w:color="FFFFFF"/>
+          <w:right w:val="nil" w:sz="0" w:color="FFFFFF"/>
+          <w:insideH w:val="nil"/>
+          <w:insideV w:val="nil"/>
+        </w:tblBorders>
+        <w:tblW w:w="9639" w:type="dxa"/>
+        <w:tblLayout w:type="fixed"/>
+      </w:tblPr>
+      <w:tblGrid>
         <w:gridCol w:w="9639"/>
       </w:tblGrid>
       <w:tr>
         <w:tc>
           <w:tcPr>
             <w:tcW w:type="dxa" w:w="9638"/>
-            <w:shd w:val="clear" w:color="auto" w:fill="00A19A"/>
+            <w:shd w:val="clear" w:color="auto" w:fill="1E3A5F"/>
             <w:tcMar>
-              <w:top w:w="260" w:type="dxa"/>
-              <w:bottom w:w="260" w:type="dxa"/>
-              <w:start w:w="500" w:type="dxa"/>
-              <w:end w:w="500" w:type="dxa"/>
+              <w:top w:w="300" w:type="dxa"/>
+              <w:bottom w:w="300" w:type="dxa"/>
+              <w:start w:w="400" w:type="dxa"/>
+              <w:end w:w="400" w:type="dxa"/>
             </w:tcMar>
           </w:tcPr>
           <w:p>
             <w:r>
               <w:rPr>
                 <w:b/>
-                <w:color w:val="FFFFFF"/>
-                <w:sz w:val="20"/>
+                <w:color w:val="F3B37E"/>
+                <w:sz w:val="18"/>
+                <w:spacing w:val="30"/>
               </w:rPr>
               <w:t>INSIDE THIS PACK</w:t>
             </w:r>
           </w:p>
           <w:p>
+            <w:pPr>
+              <w:spacing w:after="0"/>
+            </w:pPr>
             <w:r>
               <w:rPr>
                 <w:color w:val="FFFFFF"/>
-                <w:sz w:val="21"/>
+                <w:sz w:val="22"/>
               </w:rPr>
               <w:t>About IWS   ·   Your engagement   ·   Before your first shift   ·   Connecteam   ·   Code of Conduct   ·   Safety and incidents   ·   Pay   ·   Key contacts   ·   Sign-off</w:t>
             </w:r>
@@ -160,64 +339,14 @@
     </w:tbl>
     <w:p>
       <w:pPr>
-        <w:spacing w:before="280"/>
+        <w:spacing w:before="320"/>
       </w:pPr>
       <w:r>
         <w:rPr>
-          <w:b w:val="0"/>
-          <w:i w:val="0"/>
           <w:color w:val="5B6770"/>
           <w:sz w:val="18"/>
         </w:rPr>
-        <w:t xml:space="preserve">Version 1.0  |  October 2026  |  </w:t>
-      </w:r>
-      <w:r>
-        <w:rPr>
-          <w:b/>
-          <w:i w:val="0"/>
-          <w:color w:val="8A5A00"/>
-          <w:sz w:val="18"/>
-          <w:shd w:val="clear" w:color="auto" w:fill="FFF4D6"/>
-        </w:rPr>
-        <w:t>[IWS ABN]</w:t>
-      </w:r>
-      <w:r>
-        <w:rPr>
-          <w:b w:val="0"/>
-          <w:i w:val="0"/>
-          <w:color w:val="5B6770"/>
-          <w:sz w:val="18"/>
-        </w:rPr>
-        <w:t xml:space="preserve">  |  </w:t>
-      </w:r>
-      <w:r>
-        <w:rPr>
-          <w:b/>
-          <w:i w:val="0"/>
-          <w:color w:val="8A5A00"/>
-          <w:sz w:val="18"/>
-          <w:shd w:val="clear" w:color="auto" w:fill="FFF4D6"/>
-        </w:rPr>
-        <w:t>[IWS phone]</w:t>
-      </w:r>
-      <w:r>
-        <w:rPr>
-          <w:b w:val="0"/>
-          <w:i w:val="0"/>
-          <w:color w:val="5B6770"/>
-          <w:sz w:val="18"/>
-        </w:rPr>
-        <w:t xml:space="preserve">  |  </w:t>
-      </w:r>
-      <w:r>
-        <w:rPr>
-          <w:b/>
-          <w:i w:val="0"/>
-          <w:color w:val="8A5A00"/>
-          <w:sz w:val="18"/>
-          <w:shd w:val="clear" w:color="auto" w:fill="FFF4D6"/>
-        </w:rPr>
-        <w:t>[IWS email]</w:t>
+        <w:t>Version 1.0  |  October 2026</w:t>
       </w:r>
     </w:p>
     <w:tbl>
@@ -242,7 +371,7 @@
         <w:tc>
           <w:tcPr>
             <w:tcW w:type="dxa" w:w="794"/>
-            <w:shd w:val="clear" w:color="auto" w:fill="00A19A"/>
+            <w:shd w:val="clear" w:color="auto" w:fill="E07A2E"/>
             <w:tcMar>
               <w:top w:w="120" w:type="dxa"/>
               <w:bottom w:w="120" w:type="dxa"/>
@@ -269,7 +398,7 @@
         <w:tc>
           <w:tcPr>
             <w:tcW w:type="dxa" w:w="8844"/>
-            <w:shd w:val="clear" w:color="auto" w:fill="16325C"/>
+            <w:shd w:val="clear" w:color="auto" w:fill="1E3A5F"/>
             <w:tcMar>
               <w:top w:w="120" w:type="dxa"/>
               <w:bottom w:w="120" w:type="dxa"/>
@@ -310,9 +439,9 @@
         <w:rPr>
           <w:b/>
           <w:i w:val="0"/>
-          <w:color w:val="8A5A00"/>
+          <w:color w:val="6B4E00"/>
           <w:sz w:val="21"/>
-          <w:shd w:val="clear" w:color="auto" w:fill="FFF4D6"/>
+          <w:shd w:val="clear" w:color="auto" w:fill="FFF2A8"/>
         </w:rPr>
         <w:t>[Worker first name]</w:t>
       </w:r>
@@ -340,11 +469,11 @@
         <w:rPr>
           <w:b/>
           <w:i w:val="0"/>
-          <w:color w:val="8A5A00"/>
+          <w:color w:val="6B4E00"/>
           <w:sz w:val="21"/>
-          <w:shd w:val="clear" w:color="auto" w:fill="FFF4D6"/>
+          <w:shd w:val="clear" w:color="auto" w:fill="FFF2A8"/>
         </w:rPr>
-        <w:t>[service region, e.g. Greater Western Sydney]</w:t>
+        <w:t>[service region, e.g. Sydney's Hills District and surrounds]</w:t>
       </w:r>
       <w:r>
         <w:rPr>
@@ -423,12 +552,12 @@
         <w:tc>
           <w:tcPr>
             <w:tcW w:type="dxa" w:w="9638"/>
-            <w:shd w:val="clear" w:color="auto" w:fill="E6F5F4"/>
+            <w:shd w:val="clear" w:color="auto" w:fill="F7F9FC"/>
             <w:tcBorders>
               <w:top w:val="nil"/>
               <w:bottom w:val="nil"/>
               <w:right w:val="nil"/>
-              <w:left w:val="single" w:sz="36" w:color="00A19A"/>
+              <w:left w:val="single" w:sz="36" w:color="1E3A5F"/>
             </w:tcBorders>
             <w:tcMar>
               <w:top w:w="140" w:type="dxa"/>
@@ -441,7 +570,7 @@
             <w:r>
               <w:rPr>
                 <w:b/>
-                <w:color w:val="16325C"/>
+                <w:color w:val="1E3A5F"/>
                 <w:sz w:val="22"/>
               </w:rPr>
               <w:t>Our promise to you</w:t>
@@ -557,7 +686,7 @@
         <w:tc>
           <w:tcPr>
             <w:tcW w:type="dxa" w:w="794"/>
-            <w:shd w:val="clear" w:color="auto" w:fill="00A19A"/>
+            <w:shd w:val="clear" w:color="auto" w:fill="E07A2E"/>
             <w:tcMar>
               <w:top w:w="120" w:type="dxa"/>
               <w:bottom w:w="120" w:type="dxa"/>
@@ -583,7 +712,7 @@
         <w:tc>
           <w:tcPr>
             <w:tcW w:type="dxa" w:w="8844"/>
-            <w:shd w:val="clear" w:color="auto" w:fill="16325C"/>
+            <w:shd w:val="clear" w:color="auto" w:fill="1E3A5F"/>
             <w:tcMar>
               <w:top w:w="120" w:type="dxa"/>
               <w:bottom w:w="120" w:type="dxa"/>
@@ -660,12 +789,12 @@
         <w:jc w:val="center"/>
         <w:tblLook w:firstColumn="1" w:firstRow="1" w:lastColumn="0" w:lastRow="0" w:noHBand="0" w:noVBand="1" w:val="04A0"/>
         <w:tblBorders>
-          <w:top w:val="single" w:sz="4" w:color="D5DDE2"/>
-          <w:left w:val="single" w:sz="4" w:color="D5DDE2"/>
-          <w:bottom w:val="single" w:sz="4" w:color="D5DDE2"/>
-          <w:right w:val="single" w:sz="4" w:color="D5DDE2"/>
-          <w:insideH w:val="single" w:sz="4" w:color="D5DDE2"/>
-          <w:insideV w:val="single" w:sz="4" w:color="D5DDE2"/>
+          <w:top w:val="single" w:sz="4" w:color="E3E8EF"/>
+          <w:left w:val="single" w:sz="4" w:color="E3E8EF"/>
+          <w:bottom w:val="single" w:sz="4" w:color="E3E8EF"/>
+          <w:right w:val="single" w:sz="4" w:color="E3E8EF"/>
+          <w:insideH w:val="single" w:sz="4" w:color="E3E8EF"/>
+          <w:insideV w:val="single" w:sz="4" w:color="E3E8EF"/>
         </w:tblBorders>
         <w:tblW w:w="9639" w:type="dxa"/>
         <w:tblLayout w:type="fixed"/>
@@ -681,7 +810,7 @@
         <w:tc>
           <w:tcPr>
             <w:tcW w:type="dxa" w:w="2268"/>
-            <w:shd w:val="clear" w:color="auto" w:fill="16325C"/>
+            <w:shd w:val="clear" w:color="auto" w:fill="1E3A5F"/>
             <w:tcMar>
               <w:top w:w="90" w:type="dxa"/>
               <w:bottom w:w="90" w:type="dxa"/>
@@ -703,7 +832,7 @@
         <w:tc>
           <w:tcPr>
             <w:tcW w:type="dxa" w:w="7370"/>
-            <w:shd w:val="clear" w:color="auto" w:fill="16325C"/>
+            <w:shd w:val="clear" w:color="auto" w:fill="1E3A5F"/>
             <w:tcMar>
               <w:top w:w="90" w:type="dxa"/>
               <w:bottom w:w="90" w:type="dxa"/>
@@ -1030,7 +1159,7 @@
         <w:tc>
           <w:tcPr>
             <w:tcW w:type="dxa" w:w="794"/>
-            <w:shd w:val="clear" w:color="auto" w:fill="00A19A"/>
+            <w:shd w:val="clear" w:color="auto" w:fill="E07A2E"/>
             <w:tcMar>
               <w:top w:w="120" w:type="dxa"/>
               <w:bottom w:w="120" w:type="dxa"/>
@@ -1041,7 +1170,6 @@
           </w:tcPr>
           <w:p>
             <w:pPr>
-              <w:pageBreakBefore/>
               <w:jc w:val="center"/>
             </w:pPr>
             <w:r>
@@ -1057,7 +1185,7 @@
         <w:tc>
           <w:tcPr>
             <w:tcW w:type="dxa" w:w="8844"/>
-            <w:shd w:val="clear" w:color="auto" w:fill="16325C"/>
+            <w:shd w:val="clear" w:color="auto" w:fill="1E3A5F"/>
             <w:tcMar>
               <w:top w:w="120" w:type="dxa"/>
               <w:bottom w:w="120" w:type="dxa"/>
@@ -1100,12 +1228,12 @@
         <w:jc w:val="center"/>
         <w:tblLook w:firstColumn="1" w:firstRow="1" w:lastColumn="0" w:lastRow="0" w:noHBand="0" w:noVBand="1" w:val="04A0"/>
         <w:tblBorders>
-          <w:top w:val="single" w:sz="4" w:color="D5DDE2"/>
-          <w:left w:val="single" w:sz="4" w:color="D5DDE2"/>
-          <w:bottom w:val="single" w:sz="4" w:color="D5DDE2"/>
-          <w:right w:val="single" w:sz="4" w:color="D5DDE2"/>
-          <w:insideH w:val="single" w:sz="4" w:color="D5DDE2"/>
-          <w:insideV w:val="single" w:sz="4" w:color="D5DDE2"/>
+          <w:top w:val="single" w:sz="4" w:color="E3E8EF"/>
+          <w:left w:val="single" w:sz="4" w:color="E3E8EF"/>
+          <w:bottom w:val="single" w:sz="4" w:color="E3E8EF"/>
+          <w:right w:val="single" w:sz="4" w:color="E3E8EF"/>
+          <w:insideH w:val="single" w:sz="4" w:color="E3E8EF"/>
+          <w:insideV w:val="single" w:sz="4" w:color="E3E8EF"/>
         </w:tblBorders>
         <w:tblW w:w="9639" w:type="dxa"/>
         <w:tblLayout w:type="fixed"/>
@@ -1122,7 +1250,7 @@
         <w:tc>
           <w:tcPr>
             <w:tcW w:type="dxa" w:w="1814"/>
-            <w:shd w:val="clear" w:color="auto" w:fill="16325C"/>
+            <w:shd w:val="clear" w:color="auto" w:fill="1E3A5F"/>
             <w:tcMar>
               <w:top w:w="90" w:type="dxa"/>
               <w:bottom w:w="90" w:type="dxa"/>
@@ -1144,7 +1272,7 @@
         <w:tc>
           <w:tcPr>
             <w:tcW w:type="dxa" w:w="3912"/>
-            <w:shd w:val="clear" w:color="auto" w:fill="16325C"/>
+            <w:shd w:val="clear" w:color="auto" w:fill="1E3A5F"/>
             <w:tcMar>
               <w:top w:w="90" w:type="dxa"/>
               <w:bottom w:w="90" w:type="dxa"/>
@@ -1166,7 +1294,7 @@
         <w:tc>
           <w:tcPr>
             <w:tcW w:type="dxa" w:w="3912"/>
-            <w:shd w:val="clear" w:color="auto" w:fill="16325C"/>
+            <w:shd w:val="clear" w:color="auto" w:fill="1E3A5F"/>
             <w:tcMar>
               <w:top w:w="90" w:type="dxa"/>
               <w:bottom w:w="90" w:type="dxa"/>
@@ -1868,12 +1996,12 @@
         <w:tc>
           <w:tcPr>
             <w:tcW w:type="dxa" w:w="9638"/>
-            <w:shd w:val="clear" w:color="auto" w:fill="FFF4D6"/>
+            <w:shd w:val="clear" w:color="auto" w:fill="FDF1E7"/>
             <w:tcBorders>
               <w:top w:val="nil"/>
               <w:bottom w:val="nil"/>
               <w:right w:val="nil"/>
-              <w:left w:val="single" w:sz="36" w:color="F2A900"/>
+              <w:left w:val="single" w:sz="36" w:color="E07A2E"/>
             </w:tcBorders>
             <w:tcMar>
               <w:top w:w="140" w:type="dxa"/>
@@ -1886,7 +2014,7 @@
             <w:r>
               <w:rPr>
                 <w:b/>
-                <w:color w:val="16325C"/>
+                <w:color w:val="1E3A5F"/>
                 <w:sz w:val="22"/>
               </w:rPr>
               <w:t>Not sure which you are?</w:t>
@@ -1933,7 +2061,7 @@
         <w:tc>
           <w:tcPr>
             <w:tcW w:type="dxa" w:w="794"/>
-            <w:shd w:val="clear" w:color="auto" w:fill="00A19A"/>
+            <w:shd w:val="clear" w:color="auto" w:fill="E07A2E"/>
             <w:tcMar>
               <w:top w:w="120" w:type="dxa"/>
               <w:bottom w:w="120" w:type="dxa"/>
@@ -1959,7 +2087,7 @@
         <w:tc>
           <w:tcPr>
             <w:tcW w:type="dxa" w:w="8844"/>
-            <w:shd w:val="clear" w:color="auto" w:fill="16325C"/>
+            <w:shd w:val="clear" w:color="auto" w:fill="1E3A5F"/>
             <w:tcMar>
               <w:top w:w="120" w:type="dxa"/>
               <w:bottom w:w="120" w:type="dxa"/>
@@ -2013,7 +2141,7 @@
       <w:r>
         <w:rPr>
           <w:b/>
-          <w:color w:val="16325C"/>
+          <w:color w:val="1E3A5F"/>
         </w:rPr>
         <w:t xml:space="preserve">☐  </w:t>
       </w:r>
@@ -2044,7 +2172,7 @@
       <w:r>
         <w:rPr>
           <w:b/>
-          <w:color w:val="16325C"/>
+          <w:color w:val="1E3A5F"/>
         </w:rPr>
         <w:t xml:space="preserve">☐  </w:t>
       </w:r>
@@ -2075,7 +2203,7 @@
       <w:r>
         <w:rPr>
           <w:b/>
-          <w:color w:val="16325C"/>
+          <w:color w:val="1E3A5F"/>
         </w:rPr>
         <w:t xml:space="preserve">☐  </w:t>
       </w:r>
@@ -2115,7 +2243,7 @@
       <w:r>
         <w:rPr>
           <w:b/>
-          <w:color w:val="16325C"/>
+          <w:color w:val="1E3A5F"/>
         </w:rPr>
         <w:t xml:space="preserve">☐  </w:t>
       </w:r>
@@ -2173,7 +2301,7 @@
       <w:r>
         <w:rPr>
           <w:b/>
-          <w:color w:val="16325C"/>
+          <w:color w:val="1E3A5F"/>
         </w:rPr>
         <w:t xml:space="preserve">☐  </w:t>
       </w:r>
@@ -2204,7 +2332,7 @@
       <w:r>
         <w:rPr>
           <w:b/>
-          <w:color w:val="16325C"/>
+          <w:color w:val="1E3A5F"/>
         </w:rPr>
         <w:t xml:space="preserve">☐  </w:t>
       </w:r>
@@ -2235,7 +2363,7 @@
       <w:r>
         <w:rPr>
           <w:b/>
-          <w:color w:val="16325C"/>
+          <w:color w:val="1E3A5F"/>
         </w:rPr>
         <w:t xml:space="preserve">☐  </w:t>
       </w:r>
@@ -2275,7 +2403,7 @@
       <w:r>
         <w:rPr>
           <w:b/>
-          <w:color w:val="16325C"/>
+          <w:color w:val="1E3A5F"/>
         </w:rPr>
         <w:t xml:space="preserve">☐  </w:t>
       </w:r>
@@ -2306,7 +2434,7 @@
       <w:r>
         <w:rPr>
           <w:b/>
-          <w:color w:val="16325C"/>
+          <w:color w:val="1E3A5F"/>
         </w:rPr>
         <w:t xml:space="preserve">☐  </w:t>
       </w:r>
@@ -2337,7 +2465,7 @@
       <w:r>
         <w:rPr>
           <w:b/>
-          <w:color w:val="16325C"/>
+          <w:color w:val="1E3A5F"/>
         </w:rPr>
         <w:t xml:space="preserve">☐  </w:t>
       </w:r>
@@ -2368,7 +2496,7 @@
       <w:r>
         <w:rPr>
           <w:b/>
-          <w:color w:val="16325C"/>
+          <w:color w:val="1E3A5F"/>
         </w:rPr>
         <w:t xml:space="preserve">☐  </w:t>
       </w:r>
@@ -2398,7 +2526,7 @@
       <w:r>
         <w:rPr>
           <w:b/>
-          <w:color w:val="16325C"/>
+          <w:color w:val="1E3A5F"/>
         </w:rPr>
         <w:t xml:space="preserve">☐  </w:t>
       </w:r>
@@ -2420,7 +2548,7 @@
       <w:r>
         <w:rPr>
           <w:b/>
-          <w:color w:val="16325C"/>
+          <w:color w:val="1E3A5F"/>
         </w:rPr>
         <w:t xml:space="preserve">☐  </w:t>
       </w:r>
@@ -2442,7 +2570,7 @@
       <w:r>
         <w:rPr>
           <w:b/>
-          <w:color w:val="16325C"/>
+          <w:color w:val="1E3A5F"/>
         </w:rPr>
         <w:t xml:space="preserve">☐  </w:t>
       </w:r>
@@ -2464,7 +2592,7 @@
       <w:r>
         <w:rPr>
           <w:b/>
-          <w:color w:val="16325C"/>
+          <w:color w:val="1E3A5F"/>
         </w:rPr>
         <w:t xml:space="preserve">☐  </w:t>
       </w:r>
@@ -2494,7 +2622,7 @@
       <w:r>
         <w:rPr>
           <w:b/>
-          <w:color w:val="16325C"/>
+          <w:color w:val="1E3A5F"/>
         </w:rPr>
         <w:t xml:space="preserve">☐  </w:t>
       </w:r>
@@ -2516,7 +2644,7 @@
       <w:r>
         <w:rPr>
           <w:b/>
-          <w:color w:val="16325C"/>
+          <w:color w:val="1E3A5F"/>
         </w:rPr>
         <w:t xml:space="preserve">☐  </w:t>
       </w:r>
@@ -2538,7 +2666,7 @@
       <w:r>
         <w:rPr>
           <w:b/>
-          <w:color w:val="16325C"/>
+          <w:color w:val="1E3A5F"/>
         </w:rPr>
         <w:t xml:space="preserve">☐  </w:t>
       </w:r>
@@ -2560,7 +2688,7 @@
       <w:r>
         <w:rPr>
           <w:b/>
-          <w:color w:val="16325C"/>
+          <w:color w:val="1E3A5F"/>
         </w:rPr>
         <w:t xml:space="preserve">☐  </w:t>
       </w:r>
@@ -2582,7 +2710,7 @@
       <w:r>
         <w:rPr>
           <w:b/>
-          <w:color w:val="16325C"/>
+          <w:color w:val="1E3A5F"/>
         </w:rPr>
         <w:t xml:space="preserve">☐  </w:t>
       </w:r>
@@ -2604,7 +2732,7 @@
       <w:r>
         <w:rPr>
           <w:b/>
-          <w:color w:val="16325C"/>
+          <w:color w:val="1E3A5F"/>
         </w:rPr>
         <w:t xml:space="preserve">☐  </w:t>
       </w:r>
@@ -2642,12 +2770,12 @@
         <w:tc>
           <w:tcPr>
             <w:tcW w:type="dxa" w:w="9638"/>
-            <w:shd w:val="clear" w:color="auto" w:fill="E6F5F4"/>
+            <w:shd w:val="clear" w:color="auto" w:fill="F7F9FC"/>
             <w:tcBorders>
               <w:top w:val="nil"/>
               <w:bottom w:val="nil"/>
               <w:right w:val="nil"/>
-              <w:left w:val="single" w:sz="36" w:color="00A19A"/>
+              <w:left w:val="single" w:sz="36" w:color="1E3A5F"/>
             </w:tcBorders>
             <w:tcMar>
               <w:top w:w="140" w:type="dxa"/>
@@ -2660,7 +2788,7 @@
             <w:r>
               <w:rPr>
                 <w:b/>
-                <w:color w:val="16325C"/>
+                <w:color w:val="1E3A5F"/>
                 <w:sz w:val="22"/>
               </w:rPr>
               <w:t>Some sites need extra training</w:t>
@@ -2707,7 +2835,7 @@
         <w:tc>
           <w:tcPr>
             <w:tcW w:type="dxa" w:w="794"/>
-            <w:shd w:val="clear" w:color="auto" w:fill="00A19A"/>
+            <w:shd w:val="clear" w:color="auto" w:fill="E07A2E"/>
             <w:tcMar>
               <w:top w:w="120" w:type="dxa"/>
               <w:bottom w:w="120" w:type="dxa"/>
@@ -2718,7 +2846,6 @@
           </w:tcPr>
           <w:p>
             <w:pPr>
-              <w:pageBreakBefore/>
               <w:jc w:val="center"/>
             </w:pPr>
             <w:r>
@@ -2734,7 +2861,7 @@
         <w:tc>
           <w:tcPr>
             <w:tcW w:type="dxa" w:w="8844"/>
-            <w:shd w:val="clear" w:color="auto" w:fill="16325C"/>
+            <w:shd w:val="clear" w:color="auto" w:fill="1E3A5F"/>
             <w:tcMar>
               <w:top w:w="120" w:type="dxa"/>
               <w:bottom w:w="120" w:type="dxa"/>
@@ -2815,7 +2942,7 @@
         <w:tc>
           <w:tcPr>
             <w:tcW w:type="dxa" w:w="510"/>
-            <w:shd w:val="clear" w:color="auto" w:fill="16325C"/>
+            <w:shd w:val="clear" w:color="auto" w:fill="1E3A5F"/>
             <w:tcMar>
               <w:top w:w="80" w:type="dxa"/>
               <w:bottom w:w="80" w:type="dxa"/>
@@ -2901,7 +3028,7 @@
         <w:tc>
           <w:tcPr>
             <w:tcW w:type="dxa" w:w="510"/>
-            <w:shd w:val="clear" w:color="auto" w:fill="16325C"/>
+            <w:shd w:val="clear" w:color="auto" w:fill="1E3A5F"/>
             <w:tcMar>
               <w:top w:w="80" w:type="dxa"/>
               <w:bottom w:w="80" w:type="dxa"/>
@@ -2987,7 +3114,7 @@
         <w:tc>
           <w:tcPr>
             <w:tcW w:type="dxa" w:w="510"/>
-            <w:shd w:val="clear" w:color="auto" w:fill="16325C"/>
+            <w:shd w:val="clear" w:color="auto" w:fill="1E3A5F"/>
             <w:tcMar>
               <w:top w:w="80" w:type="dxa"/>
               <w:bottom w:w="80" w:type="dxa"/>
@@ -3073,7 +3200,7 @@
         <w:tc>
           <w:tcPr>
             <w:tcW w:type="dxa" w:w="510"/>
-            <w:shd w:val="clear" w:color="auto" w:fill="16325C"/>
+            <w:shd w:val="clear" w:color="auto" w:fill="1E3A5F"/>
             <w:tcMar>
               <w:top w:w="80" w:type="dxa"/>
               <w:bottom w:w="80" w:type="dxa"/>
@@ -3159,7 +3286,7 @@
         <w:tc>
           <w:tcPr>
             <w:tcW w:type="dxa" w:w="510"/>
-            <w:shd w:val="clear" w:color="auto" w:fill="16325C"/>
+            <w:shd w:val="clear" w:color="auto" w:fill="1E3A5F"/>
             <w:tcMar>
               <w:top w:w="80" w:type="dxa"/>
               <w:bottom w:w="80" w:type="dxa"/>
@@ -3245,7 +3372,7 @@
         <w:tc>
           <w:tcPr>
             <w:tcW w:type="dxa" w:w="510"/>
-            <w:shd w:val="clear" w:color="auto" w:fill="16325C"/>
+            <w:shd w:val="clear" w:color="auto" w:fill="1E3A5F"/>
             <w:tcMar>
               <w:top w:w="80" w:type="dxa"/>
               <w:bottom w:w="80" w:type="dxa"/>
@@ -3354,12 +3481,12 @@
         <w:tc>
           <w:tcPr>
             <w:tcW w:type="dxa" w:w="9638"/>
-            <w:shd w:val="clear" w:color="auto" w:fill="FFF4D6"/>
+            <w:shd w:val="clear" w:color="auto" w:fill="FDF1E7"/>
             <w:tcBorders>
               <w:top w:val="nil"/>
               <w:bottom w:val="nil"/>
               <w:right w:val="nil"/>
-              <w:left w:val="single" w:sz="36" w:color="F2A900"/>
+              <w:left w:val="single" w:sz="36" w:color="E07A2E"/>
             </w:tcBorders>
             <w:tcMar>
               <w:top w:w="140" w:type="dxa"/>
@@ -3372,7 +3499,7 @@
             <w:r>
               <w:rPr>
                 <w:b/>
-                <w:color w:val="16325C"/>
+                <w:color w:val="1E3A5F"/>
                 <w:sz w:val="22"/>
               </w:rPr>
               <w:t>Why clocking in matters</w:t>
@@ -3419,7 +3546,7 @@
         <w:tc>
           <w:tcPr>
             <w:tcW w:type="dxa" w:w="794"/>
-            <w:shd w:val="clear" w:color="auto" w:fill="00A19A"/>
+            <w:shd w:val="clear" w:color="auto" w:fill="E07A2E"/>
             <w:tcMar>
               <w:top w:w="120" w:type="dxa"/>
               <w:bottom w:w="120" w:type="dxa"/>
@@ -3445,7 +3572,7 @@
         <w:tc>
           <w:tcPr>
             <w:tcW w:type="dxa" w:w="8844"/>
-            <w:shd w:val="clear" w:color="auto" w:fill="16325C"/>
+            <w:shd w:val="clear" w:color="auto" w:fill="1E3A5F"/>
             <w:tcMar>
               <w:top w:w="120" w:type="dxa"/>
               <w:bottom w:w="120" w:type="dxa"/>
@@ -3488,7 +3615,7 @@
       <w:r>
         <w:rPr>
           <w:b/>
-          <w:color w:val="00A19A"/>
+          <w:color w:val="E07A2E"/>
         </w:rPr>
         <w:t xml:space="preserve">•  </w:t>
       </w:r>
@@ -3510,7 +3637,7 @@
       <w:r>
         <w:rPr>
           <w:b/>
-          <w:color w:val="00A19A"/>
+          <w:color w:val="E07A2E"/>
         </w:rPr>
         <w:t xml:space="preserve">•  </w:t>
       </w:r>
@@ -3568,7 +3695,7 @@
       <w:r>
         <w:rPr>
           <w:b/>
-          <w:color w:val="00A19A"/>
+          <w:color w:val="E07A2E"/>
         </w:rPr>
         <w:t xml:space="preserve">•  </w:t>
       </w:r>
@@ -3645,7 +3772,7 @@
       <w:r>
         <w:rPr>
           <w:b/>
-          <w:color w:val="00A19A"/>
+          <w:color w:val="E07A2E"/>
         </w:rPr>
         <w:t xml:space="preserve">•  </w:t>
       </w:r>
@@ -3667,7 +3794,7 @@
       <w:r>
         <w:rPr>
           <w:b/>
-          <w:color w:val="00A19A"/>
+          <w:color w:val="E07A2E"/>
         </w:rPr>
         <w:t xml:space="preserve">•  </w:t>
       </w:r>
@@ -3689,7 +3816,7 @@
       <w:r>
         <w:rPr>
           <w:b/>
-          <w:color w:val="00A19A"/>
+          <w:color w:val="E07A2E"/>
         </w:rPr>
         <w:t xml:space="preserve">•  </w:t>
       </w:r>
@@ -3711,7 +3838,7 @@
       <w:r>
         <w:rPr>
           <w:b/>
-          <w:color w:val="00A19A"/>
+          <w:color w:val="E07A2E"/>
         </w:rPr>
         <w:t xml:space="preserve">•  </w:t>
       </w:r>
@@ -3733,7 +3860,7 @@
       <w:r>
         <w:rPr>
           <w:b/>
-          <w:color w:val="00A19A"/>
+          <w:color w:val="E07A2E"/>
         </w:rPr>
         <w:t xml:space="preserve">•  </w:t>
       </w:r>
@@ -3771,12 +3898,12 @@
         <w:tc>
           <w:tcPr>
             <w:tcW w:type="dxa" w:w="9638"/>
-            <w:shd w:val="clear" w:color="auto" w:fill="E6F5F4"/>
+            <w:shd w:val="clear" w:color="auto" w:fill="F7F9FC"/>
             <w:tcBorders>
               <w:top w:val="nil"/>
               <w:bottom w:val="nil"/>
               <w:right w:val="nil"/>
-              <w:left w:val="single" w:sz="36" w:color="00A19A"/>
+              <w:left w:val="single" w:sz="36" w:color="1E3A5F"/>
             </w:tcBorders>
             <w:tcMar>
               <w:top w:w="140" w:type="dxa"/>
@@ -3789,7 +3916,7 @@
             <w:r>
               <w:rPr>
                 <w:b/>
-                <w:color w:val="16325C"/>
+                <w:color w:val="1E3A5F"/>
                 <w:sz w:val="22"/>
               </w:rPr>
               <w:t>Read the plans before you support</w:t>
@@ -3836,7 +3963,7 @@
         <w:tc>
           <w:tcPr>
             <w:tcW w:type="dxa" w:w="794"/>
-            <w:shd w:val="clear" w:color="auto" w:fill="00A19A"/>
+            <w:shd w:val="clear" w:color="auto" w:fill="E07A2E"/>
             <w:tcMar>
               <w:top w:w="120" w:type="dxa"/>
               <w:bottom w:w="120" w:type="dxa"/>
@@ -3847,7 +3974,6 @@
           </w:tcPr>
           <w:p>
             <w:pPr>
-              <w:pageBreakBefore/>
               <w:jc w:val="center"/>
             </w:pPr>
             <w:r>
@@ -3863,7 +3989,7 @@
         <w:tc>
           <w:tcPr>
             <w:tcW w:type="dxa" w:w="8844"/>
-            <w:shd w:val="clear" w:color="auto" w:fill="16325C"/>
+            <w:shd w:val="clear" w:color="auto" w:fill="1E3A5F"/>
             <w:tcMar>
               <w:top w:w="120" w:type="dxa"/>
               <w:bottom w:w="120" w:type="dxa"/>
@@ -3906,12 +4032,12 @@
         <w:jc w:val="center"/>
         <w:tblLook w:firstColumn="1" w:firstRow="1" w:lastColumn="0" w:lastRow="0" w:noHBand="0" w:noVBand="1" w:val="04A0"/>
         <w:tblBorders>
-          <w:top w:val="single" w:sz="4" w:color="D5DDE2"/>
-          <w:left w:val="single" w:sz="4" w:color="D5DDE2"/>
-          <w:bottom w:val="single" w:sz="4" w:color="D5DDE2"/>
-          <w:right w:val="single" w:sz="4" w:color="D5DDE2"/>
-          <w:insideH w:val="single" w:sz="4" w:color="D5DDE2"/>
-          <w:insideV w:val="single" w:sz="4" w:color="D5DDE2"/>
+          <w:top w:val="single" w:sz="4" w:color="E3E8EF"/>
+          <w:left w:val="single" w:sz="4" w:color="E3E8EF"/>
+          <w:bottom w:val="single" w:sz="4" w:color="E3E8EF"/>
+          <w:right w:val="single" w:sz="4" w:color="E3E8EF"/>
+          <w:insideH w:val="single" w:sz="4" w:color="E3E8EF"/>
+          <w:insideV w:val="single" w:sz="4" w:color="E3E8EF"/>
         </w:tblBorders>
         <w:tblW w:w="9639" w:type="dxa"/>
         <w:tblLayout w:type="fixed"/>
@@ -3928,7 +4054,7 @@
         <w:tc>
           <w:tcPr>
             <w:tcW w:type="dxa" w:w="454"/>
-            <w:shd w:val="clear" w:color="auto" w:fill="16325C"/>
+            <w:shd w:val="clear" w:color="auto" w:fill="1E3A5F"/>
             <w:tcMar>
               <w:top w:w="90" w:type="dxa"/>
               <w:bottom w:w="90" w:type="dxa"/>
@@ -3950,7 +4076,7 @@
         <w:tc>
           <w:tcPr>
             <w:tcW w:type="dxa" w:w="4309"/>
-            <w:shd w:val="clear" w:color="auto" w:fill="16325C"/>
+            <w:shd w:val="clear" w:color="auto" w:fill="1E3A5F"/>
             <w:tcMar>
               <w:top w:w="90" w:type="dxa"/>
               <w:bottom w:w="90" w:type="dxa"/>
@@ -3972,7 +4098,7 @@
         <w:tc>
           <w:tcPr>
             <w:tcW w:type="dxa" w:w="4876"/>
-            <w:shd w:val="clear" w:color="auto" w:fill="16325C"/>
+            <w:shd w:val="clear" w:color="auto" w:fill="1E3A5F"/>
             <w:tcMar>
               <w:top w:w="90" w:type="dxa"/>
               <w:bottom w:w="90" w:type="dxa"/>
@@ -4583,7 +4709,7 @@
       <w:r>
         <w:rPr>
           <w:b/>
-          <w:color w:val="00A19A"/>
+          <w:color w:val="E07A2E"/>
         </w:rPr>
         <w:t xml:space="preserve">•  </w:t>
       </w:r>
@@ -4605,7 +4731,7 @@
       <w:r>
         <w:rPr>
           <w:b/>
-          <w:color w:val="00A19A"/>
+          <w:color w:val="E07A2E"/>
         </w:rPr>
         <w:t xml:space="preserve">•  </w:t>
       </w:r>
@@ -4627,7 +4753,7 @@
       <w:r>
         <w:rPr>
           <w:b/>
-          <w:color w:val="00A19A"/>
+          <w:color w:val="E07A2E"/>
         </w:rPr>
         <w:t xml:space="preserve">•  </w:t>
       </w:r>
@@ -4649,7 +4775,7 @@
       <w:r>
         <w:rPr>
           <w:b/>
-          <w:color w:val="00A19A"/>
+          <w:color w:val="E07A2E"/>
         </w:rPr>
         <w:t xml:space="preserve">•  </w:t>
       </w:r>
@@ -4671,7 +4797,7 @@
       <w:r>
         <w:rPr>
           <w:b/>
-          <w:color w:val="00A19A"/>
+          <w:color w:val="E07A2E"/>
         </w:rPr>
         <w:t xml:space="preserve">•  </w:t>
       </w:r>
@@ -4693,7 +4819,7 @@
       <w:r>
         <w:rPr>
           <w:b/>
-          <w:color w:val="00A19A"/>
+          <w:color w:val="E07A2E"/>
         </w:rPr>
         <w:t xml:space="preserve">•  </w:t>
       </w:r>
@@ -4729,7 +4855,7 @@
         <w:tc>
           <w:tcPr>
             <w:tcW w:type="dxa" w:w="794"/>
-            <w:shd w:val="clear" w:color="auto" w:fill="00A19A"/>
+            <w:shd w:val="clear" w:color="auto" w:fill="E07A2E"/>
             <w:tcMar>
               <w:top w:w="120" w:type="dxa"/>
               <w:bottom w:w="120" w:type="dxa"/>
@@ -4740,7 +4866,6 @@
           </w:tcPr>
           <w:p>
             <w:pPr>
-              <w:pageBreakBefore/>
               <w:jc w:val="center"/>
             </w:pPr>
             <w:r>
@@ -4756,7 +4881,7 @@
         <w:tc>
           <w:tcPr>
             <w:tcW w:type="dxa" w:w="8844"/>
-            <w:shd w:val="clear" w:color="auto" w:fill="16325C"/>
+            <w:shd w:val="clear" w:color="auto" w:fill="1E3A5F"/>
             <w:tcMar>
               <w:top w:w="120" w:type="dxa"/>
               <w:bottom w:w="120" w:type="dxa"/>
@@ -4802,7 +4927,7 @@
       <w:r>
         <w:rPr>
           <w:b/>
-          <w:color w:val="00A19A"/>
+          <w:color w:val="E07A2E"/>
         </w:rPr>
         <w:t xml:space="preserve">•  </w:t>
       </w:r>
@@ -4833,7 +4958,7 @@
       <w:r>
         <w:rPr>
           <w:b/>
-          <w:color w:val="00A19A"/>
+          <w:color w:val="E07A2E"/>
         </w:rPr>
         <w:t xml:space="preserve">•  </w:t>
       </w:r>
@@ -4864,7 +4989,7 @@
       <w:r>
         <w:rPr>
           <w:b/>
-          <w:color w:val="00A19A"/>
+          <w:color w:val="E07A2E"/>
         </w:rPr>
         <w:t xml:space="preserve">•  </w:t>
       </w:r>
@@ -4911,12 +5036,12 @@
         <w:tc>
           <w:tcPr>
             <w:tcW w:type="dxa" w:w="9638"/>
-            <w:shd w:val="clear" w:color="auto" w:fill="FFF4D6"/>
+            <w:shd w:val="clear" w:color="auto" w:fill="FDF1E7"/>
             <w:tcBorders>
               <w:top w:val="nil"/>
               <w:bottom w:val="nil"/>
               <w:right w:val="nil"/>
-              <w:left w:val="single" w:sz="36" w:color="F2A900"/>
+              <w:left w:val="single" w:sz="36" w:color="E07A2E"/>
             </w:tcBorders>
             <w:tcMar>
               <w:top w:w="140" w:type="dxa"/>
@@ -4929,7 +5054,7 @@
             <w:r>
               <w:rPr>
                 <w:b/>
-                <w:color w:val="16325C"/>
+                <w:color w:val="1E3A5F"/>
                 <w:sz w:val="22"/>
               </w:rPr>
               <w:t>You can stop unsafe work</w:t>
@@ -4959,12 +5084,12 @@
         <w:jc w:val="center"/>
         <w:tblLook w:firstColumn="1" w:firstRow="1" w:lastColumn="0" w:lastRow="0" w:noHBand="0" w:noVBand="1" w:val="04A0"/>
         <w:tblBorders>
-          <w:top w:val="single" w:sz="4" w:color="D5DDE2"/>
-          <w:left w:val="single" w:sz="4" w:color="D5DDE2"/>
-          <w:bottom w:val="single" w:sz="4" w:color="D5DDE2"/>
-          <w:right w:val="single" w:sz="4" w:color="D5DDE2"/>
-          <w:insideH w:val="single" w:sz="4" w:color="D5DDE2"/>
-          <w:insideV w:val="single" w:sz="4" w:color="D5DDE2"/>
+          <w:top w:val="single" w:sz="4" w:color="E3E8EF"/>
+          <w:left w:val="single" w:sz="4" w:color="E3E8EF"/>
+          <w:bottom w:val="single" w:sz="4" w:color="E3E8EF"/>
+          <w:right w:val="single" w:sz="4" w:color="E3E8EF"/>
+          <w:insideH w:val="single" w:sz="4" w:color="E3E8EF"/>
+          <w:insideV w:val="single" w:sz="4" w:color="E3E8EF"/>
         </w:tblBorders>
         <w:tblW w:w="9639" w:type="dxa"/>
         <w:tblLayout w:type="fixed"/>
@@ -4980,7 +5105,7 @@
         <w:tc>
           <w:tcPr>
             <w:tcW w:type="dxa" w:w="2268"/>
-            <w:shd w:val="clear" w:color="auto" w:fill="16325C"/>
+            <w:shd w:val="clear" w:color="auto" w:fill="1E3A5F"/>
             <w:tcMar>
               <w:top w:w="90" w:type="dxa"/>
               <w:bottom w:w="90" w:type="dxa"/>
@@ -5002,7 +5127,7 @@
         <w:tc>
           <w:tcPr>
             <w:tcW w:type="dxa" w:w="7370"/>
-            <w:shd w:val="clear" w:color="auto" w:fill="16325C"/>
+            <w:shd w:val="clear" w:color="auto" w:fill="1E3A5F"/>
             <w:tcMar>
               <w:top w:w="90" w:type="dxa"/>
               <w:bottom w:w="90" w:type="dxa"/>
@@ -5441,7 +5566,7 @@
         <w:tc>
           <w:tcPr>
             <w:tcW w:type="dxa" w:w="794"/>
-            <w:shd w:val="clear" w:color="auto" w:fill="00A19A"/>
+            <w:shd w:val="clear" w:color="auto" w:fill="E07A2E"/>
             <w:tcMar>
               <w:top w:w="120" w:type="dxa"/>
               <w:bottom w:w="120" w:type="dxa"/>
@@ -5467,7 +5592,7 @@
         <w:tc>
           <w:tcPr>
             <w:tcW w:type="dxa" w:w="8844"/>
-            <w:shd w:val="clear" w:color="auto" w:fill="16325C"/>
+            <w:shd w:val="clear" w:color="auto" w:fill="1E3A5F"/>
             <w:tcMar>
               <w:top w:w="120" w:type="dxa"/>
               <w:bottom w:w="120" w:type="dxa"/>
@@ -5548,7 +5673,7 @@
         <w:tc>
           <w:tcPr>
             <w:tcW w:type="dxa" w:w="510"/>
-            <w:shd w:val="clear" w:color="auto" w:fill="16325C"/>
+            <w:shd w:val="clear" w:color="auto" w:fill="1E3A5F"/>
             <w:tcMar>
               <w:top w:w="80" w:type="dxa"/>
               <w:bottom w:w="80" w:type="dxa"/>
@@ -5634,7 +5759,7 @@
         <w:tc>
           <w:tcPr>
             <w:tcW w:type="dxa" w:w="510"/>
-            <w:shd w:val="clear" w:color="auto" w:fill="16325C"/>
+            <w:shd w:val="clear" w:color="auto" w:fill="1E3A5F"/>
             <w:tcMar>
               <w:top w:w="80" w:type="dxa"/>
               <w:bottom w:w="80" w:type="dxa"/>
@@ -5720,7 +5845,7 @@
         <w:tc>
           <w:tcPr>
             <w:tcW w:type="dxa" w:w="510"/>
-            <w:shd w:val="clear" w:color="auto" w:fill="16325C"/>
+            <w:shd w:val="clear" w:color="auto" w:fill="1E3A5F"/>
             <w:tcMar>
               <w:top w:w="80" w:type="dxa"/>
               <w:bottom w:w="80" w:type="dxa"/>
@@ -5806,7 +5931,7 @@
         <w:tc>
           <w:tcPr>
             <w:tcW w:type="dxa" w:w="510"/>
-            <w:shd w:val="clear" w:color="auto" w:fill="16325C"/>
+            <w:shd w:val="clear" w:color="auto" w:fill="1E3A5F"/>
             <w:tcMar>
               <w:top w:w="80" w:type="dxa"/>
               <w:bottom w:w="80" w:type="dxa"/>
@@ -5892,7 +6017,7 @@
         <w:tc>
           <w:tcPr>
             <w:tcW w:type="dxa" w:w="510"/>
-            <w:shd w:val="clear" w:color="auto" w:fill="16325C"/>
+            <w:shd w:val="clear" w:color="auto" w:fill="1E3A5F"/>
             <w:tcMar>
               <w:top w:w="80" w:type="dxa"/>
               <w:bottom w:w="80" w:type="dxa"/>
@@ -5978,7 +6103,7 @@
         <w:tc>
           <w:tcPr>
             <w:tcW w:type="dxa" w:w="510"/>
-            <w:shd w:val="clear" w:color="auto" w:fill="16325C"/>
+            <w:shd w:val="clear" w:color="auto" w:fill="1E3A5F"/>
             <w:tcMar>
               <w:top w:w="80" w:type="dxa"/>
               <w:bottom w:w="80" w:type="dxa"/>
@@ -6087,12 +6212,12 @@
         <w:tc>
           <w:tcPr>
             <w:tcW w:type="dxa" w:w="9638"/>
-            <w:shd w:val="clear" w:color="auto" w:fill="FFF4D6"/>
+            <w:shd w:val="clear" w:color="auto" w:fill="FDF1E7"/>
             <w:tcBorders>
               <w:top w:val="nil"/>
               <w:bottom w:val="nil"/>
               <w:right w:val="nil"/>
-              <w:left w:val="single" w:sz="36" w:color="F2A900"/>
+              <w:left w:val="single" w:sz="36" w:color="E07A2E"/>
             </w:tcBorders>
             <w:tcMar>
               <w:top w:w="140" w:type="dxa"/>
@@ -6105,7 +6230,7 @@
             <w:r>
               <w:rPr>
                 <w:b/>
-                <w:color w:val="16325C"/>
+                <w:color w:val="1E3A5F"/>
                 <w:sz w:val="22"/>
               </w:rPr>
               <w:t>Serious incidents have legal time limits</w:t>
@@ -6193,7 +6318,7 @@
       <w:r>
         <w:rPr>
           <w:b/>
-          <w:color w:val="00A19A"/>
+          <w:color w:val="E07A2E"/>
         </w:rPr>
         <w:t xml:space="preserve">•  </w:t>
       </w:r>
@@ -6215,7 +6340,7 @@
       <w:r>
         <w:rPr>
           <w:b/>
-          <w:color w:val="00A19A"/>
+          <w:color w:val="E07A2E"/>
         </w:rPr>
         <w:t xml:space="preserve">•  </w:t>
       </w:r>
@@ -6255,7 +6380,7 @@
       <w:r>
         <w:rPr>
           <w:b/>
-          <w:color w:val="00A19A"/>
+          <w:color w:val="E07A2E"/>
         </w:rPr>
         <w:t xml:space="preserve">•  </w:t>
       </w:r>
@@ -6277,7 +6402,7 @@
       <w:r>
         <w:rPr>
           <w:b/>
-          <w:color w:val="00A19A"/>
+          <w:color w:val="E07A2E"/>
         </w:rPr>
         <w:t xml:space="preserve">•  </w:t>
       </w:r>
@@ -6313,7 +6438,7 @@
         <w:tc>
           <w:tcPr>
             <w:tcW w:type="dxa" w:w="794"/>
-            <w:shd w:val="clear" w:color="auto" w:fill="00A19A"/>
+            <w:shd w:val="clear" w:color="auto" w:fill="E07A2E"/>
             <w:tcMar>
               <w:top w:w="120" w:type="dxa"/>
               <w:bottom w:w="120" w:type="dxa"/>
@@ -6324,7 +6449,6 @@
           </w:tcPr>
           <w:p>
             <w:pPr>
-              <w:pageBreakBefore/>
               <w:jc w:val="center"/>
             </w:pPr>
             <w:r>
@@ -6340,7 +6464,7 @@
         <w:tc>
           <w:tcPr>
             <w:tcW w:type="dxa" w:w="8844"/>
-            <w:shd w:val="clear" w:color="auto" w:fill="16325C"/>
+            <w:shd w:val="clear" w:color="auto" w:fill="1E3A5F"/>
             <w:tcMar>
               <w:top w:w="120" w:type="dxa"/>
               <w:bottom w:w="120" w:type="dxa"/>
@@ -6372,12 +6496,12 @@
         <w:jc w:val="center"/>
         <w:tblLook w:firstColumn="1" w:firstRow="1" w:lastColumn="0" w:lastRow="0" w:noHBand="0" w:noVBand="1" w:val="04A0"/>
         <w:tblBorders>
-          <w:top w:val="single" w:sz="4" w:color="D5DDE2"/>
-          <w:left w:val="single" w:sz="4" w:color="D5DDE2"/>
-          <w:bottom w:val="single" w:sz="4" w:color="D5DDE2"/>
-          <w:right w:val="single" w:sz="4" w:color="D5DDE2"/>
-          <w:insideH w:val="single" w:sz="4" w:color="D5DDE2"/>
-          <w:insideV w:val="single" w:sz="4" w:color="D5DDE2"/>
+          <w:top w:val="single" w:sz="4" w:color="E3E8EF"/>
+          <w:left w:val="single" w:sz="4" w:color="E3E8EF"/>
+          <w:bottom w:val="single" w:sz="4" w:color="E3E8EF"/>
+          <w:right w:val="single" w:sz="4" w:color="E3E8EF"/>
+          <w:insideH w:val="single" w:sz="4" w:color="E3E8EF"/>
+          <w:insideV w:val="single" w:sz="4" w:color="E3E8EF"/>
         </w:tblBorders>
         <w:tblW w:w="9639" w:type="dxa"/>
         <w:tblLayout w:type="fixed"/>
@@ -6394,7 +6518,7 @@
         <w:tc>
           <w:tcPr>
             <w:tcW w:type="dxa" w:w="2381"/>
-            <w:shd w:val="clear" w:color="auto" w:fill="16325C"/>
+            <w:shd w:val="clear" w:color="auto" w:fill="1E3A5F"/>
             <w:tcMar>
               <w:top w:w="90" w:type="dxa"/>
               <w:bottom w:w="90" w:type="dxa"/>
@@ -6415,7 +6539,7 @@
         <w:tc>
           <w:tcPr>
             <w:tcW w:type="dxa" w:w="3628"/>
-            <w:shd w:val="clear" w:color="auto" w:fill="16325C"/>
+            <w:shd w:val="clear" w:color="auto" w:fill="1E3A5F"/>
             <w:tcMar>
               <w:top w:w="90" w:type="dxa"/>
               <w:bottom w:w="90" w:type="dxa"/>
@@ -6437,7 +6561,7 @@
         <w:tc>
           <w:tcPr>
             <w:tcW w:type="dxa" w:w="3628"/>
-            <w:shd w:val="clear" w:color="auto" w:fill="16325C"/>
+            <w:shd w:val="clear" w:color="auto" w:fill="1E3A5F"/>
             <w:tcMar>
               <w:top w:w="90" w:type="dxa"/>
               <w:bottom w:w="90" w:type="dxa"/>
@@ -6586,9 +6710,9 @@
               <w:rPr>
                 <w:b/>
                 <w:i w:val="0"/>
-                <w:color w:val="8A5A00"/>
+                <w:color w:val="6B4E00"/>
                 <w:sz w:val="19"/>
-                <w:shd w:val="clear" w:color="auto" w:fill="FFF4D6"/>
+                <w:shd w:val="clear" w:color="auto" w:fill="FFF2A8"/>
               </w:rPr>
               <w:t>[Weekly / fortnightly]</w:t>
             </w:r>
@@ -6605,9 +6729,9 @@
               <w:rPr>
                 <w:b/>
                 <w:i w:val="0"/>
-                <w:color w:val="8A5A00"/>
+                <w:color w:val="6B4E00"/>
                 <w:sz w:val="19"/>
-                <w:shd w:val="clear" w:color="auto" w:fill="FFF4D6"/>
+                <w:shd w:val="clear" w:color="auto" w:fill="FFF2A8"/>
               </w:rPr>
               <w:t>[day]</w:t>
             </w:r>
@@ -6641,9 +6765,9 @@
               <w:rPr>
                 <w:b/>
                 <w:i w:val="0"/>
-                <w:color w:val="8A5A00"/>
+                <w:color w:val="6B4E00"/>
                 <w:sz w:val="19"/>
-                <w:shd w:val="clear" w:color="auto" w:fill="FFF4D6"/>
+                <w:shd w:val="clear" w:color="auto" w:fill="FFF2A8"/>
               </w:rPr>
               <w:t>[weekly / fortnightly]</w:t>
             </w:r>
@@ -6706,9 +6830,9 @@
               <w:rPr>
                 <w:b/>
                 <w:i w:val="0"/>
-                <w:color w:val="8A5A00"/>
+                <w:color w:val="6B4E00"/>
                 <w:sz w:val="19"/>
-                <w:shd w:val="clear" w:color="auto" w:fill="FFF4D6"/>
+                <w:shd w:val="clear" w:color="auto" w:fill="FFF2A8"/>
               </w:rPr>
               <w:t>[Payday, e.g. Wednesday after period ends]</w:t>
             </w:r>
@@ -6741,9 +6865,9 @@
               <w:rPr>
                 <w:b/>
                 <w:i w:val="0"/>
-                <w:color w:val="8A5A00"/>
+                <w:color w:val="6B4E00"/>
                 <w:sz w:val="19"/>
-                <w:shd w:val="clear" w:color="auto" w:fill="FFF4D6"/>
+                <w:shd w:val="clear" w:color="auto" w:fill="FFF2A8"/>
               </w:rPr>
               <w:t>[X]</w:t>
             </w:r>
@@ -7027,7 +7151,7 @@
       <w:r>
         <w:rPr>
           <w:b/>
-          <w:color w:val="00A19A"/>
+          <w:color w:val="E07A2E"/>
         </w:rPr>
         <w:t xml:space="preserve">•  </w:t>
       </w:r>
@@ -7049,7 +7173,7 @@
       <w:r>
         <w:rPr>
           <w:b/>
-          <w:color w:val="00A19A"/>
+          <w:color w:val="E07A2E"/>
         </w:rPr>
         <w:t xml:space="preserve">•  </w:t>
       </w:r>
@@ -7071,7 +7195,7 @@
       <w:r>
         <w:rPr>
           <w:b/>
-          <w:color w:val="00A19A"/>
+          <w:color w:val="E07A2E"/>
         </w:rPr>
         <w:t xml:space="preserve">•  </w:t>
       </w:r>
@@ -7093,7 +7217,7 @@
       <w:r>
         <w:rPr>
           <w:b/>
-          <w:color w:val="00A19A"/>
+          <w:color w:val="E07A2E"/>
         </w:rPr>
         <w:t xml:space="preserve">•  </w:t>
       </w:r>
@@ -7115,7 +7239,7 @@
       <w:r>
         <w:rPr>
           <w:b/>
-          <w:color w:val="00A19A"/>
+          <w:color w:val="E07A2E"/>
         </w:rPr>
         <w:t xml:space="preserve">•  </w:t>
       </w:r>
@@ -7145,7 +7269,7 @@
       <w:r>
         <w:rPr>
           <w:b/>
-          <w:color w:val="00A19A"/>
+          <w:color w:val="E07A2E"/>
         </w:rPr>
         <w:t xml:space="preserve">•  </w:t>
       </w:r>
@@ -7180,9 +7304,9 @@
         <w:rPr>
           <w:b/>
           <w:i w:val="0"/>
-          <w:color w:val="8A5A00"/>
+          <w:color w:val="6B4E00"/>
           <w:sz w:val="21"/>
-          <w:shd w:val="clear" w:color="auto" w:fill="FFF4D6"/>
+          <w:shd w:val="clear" w:color="auto" w:fill="FFF2A8"/>
         </w:rPr>
         <w:t>[X hours]</w:t>
       </w:r>
@@ -7204,7 +7328,7 @@
       <w:r>
         <w:rPr>
           <w:b/>
-          <w:color w:val="00A19A"/>
+          <w:color w:val="E07A2E"/>
         </w:rPr>
         <w:t xml:space="preserve">•  </w:t>
       </w:r>
@@ -7244,7 +7368,7 @@
       <w:r>
         <w:rPr>
           <w:b/>
-          <w:color w:val="00A19A"/>
+          <w:color w:val="E07A2E"/>
         </w:rPr>
         <w:t xml:space="preserve">•  </w:t>
       </w:r>
@@ -7298,7 +7422,7 @@
         <w:tc>
           <w:tcPr>
             <w:tcW w:type="dxa" w:w="794"/>
-            <w:shd w:val="clear" w:color="auto" w:fill="00A19A"/>
+            <w:shd w:val="clear" w:color="auto" w:fill="E07A2E"/>
             <w:tcMar>
               <w:top w:w="120" w:type="dxa"/>
               <w:bottom w:w="120" w:type="dxa"/>
@@ -7324,7 +7448,7 @@
         <w:tc>
           <w:tcPr>
             <w:tcW w:type="dxa" w:w="8844"/>
-            <w:shd w:val="clear" w:color="auto" w:fill="16325C"/>
+            <w:shd w:val="clear" w:color="auto" w:fill="1E3A5F"/>
             <w:tcMar>
               <w:top w:w="120" w:type="dxa"/>
               <w:bottom w:w="120" w:type="dxa"/>
@@ -7367,7 +7491,7 @@
       <w:r>
         <w:rPr>
           <w:b/>
-          <w:color w:val="00A19A"/>
+          <w:color w:val="E07A2E"/>
         </w:rPr>
         <w:t xml:space="preserve">•  </w:t>
       </w:r>
@@ -7389,7 +7513,7 @@
       <w:r>
         <w:rPr>
           <w:b/>
-          <w:color w:val="00A19A"/>
+          <w:color w:val="E07A2E"/>
         </w:rPr>
         <w:t xml:space="preserve">•  </w:t>
       </w:r>
@@ -7411,7 +7535,7 @@
       <w:r>
         <w:rPr>
           <w:b/>
-          <w:color w:val="00A19A"/>
+          <w:color w:val="E07A2E"/>
         </w:rPr>
         <w:t xml:space="preserve">•  </w:t>
       </w:r>
@@ -7469,7 +7593,7 @@
         <w:tc>
           <w:tcPr>
             <w:tcW w:type="dxa" w:w="510"/>
-            <w:shd w:val="clear" w:color="auto" w:fill="16325C"/>
+            <w:shd w:val="clear" w:color="auto" w:fill="1E3A5F"/>
             <w:tcMar>
               <w:top w:w="80" w:type="dxa"/>
               <w:bottom w:w="80" w:type="dxa"/>
@@ -7546,7 +7670,7 @@
         <w:tc>
           <w:tcPr>
             <w:tcW w:type="dxa" w:w="510"/>
-            <w:shd w:val="clear" w:color="auto" w:fill="16325C"/>
+            <w:shd w:val="clear" w:color="auto" w:fill="1E3A5F"/>
             <w:tcMar>
               <w:top w:w="80" w:type="dxa"/>
               <w:bottom w:w="80" w:type="dxa"/>
@@ -7587,26 +7711,7 @@
                 <w:color w:val="1F2933"/>
                 <w:sz w:val="21"/>
               </w:rPr>
-              <w:t xml:space="preserve">If not resolved, email the Director at </w:t>
-            </w:r>
-            <w:r>
-              <w:rPr>
-                <w:b/>
-                <w:i w:val="0"/>
-                <w:color w:val="8A5A00"/>
-                <w:sz w:val="21"/>
-                <w:shd w:val="clear" w:color="auto" w:fill="FFF4D6"/>
-              </w:rPr>
-              <w:t>[IWS complaints email]</w:t>
-            </w:r>
-            <w:r>
-              <w:rPr>
-                <w:b w:val="0"/>
-                <w:i w:val="0"/>
-                <w:color w:val="1F2933"/>
-                <w:sz w:val="21"/>
-              </w:rPr>
-              <w:t>.</w:t>
+              <w:t>If not resolved, email the Director at michael.sibanda@interactivews.com.</w:t>
             </w:r>
           </w:p>
         </w:tc>
@@ -7642,7 +7747,7 @@
         <w:tc>
           <w:tcPr>
             <w:tcW w:type="dxa" w:w="510"/>
-            <w:shd w:val="clear" w:color="auto" w:fill="16325C"/>
+            <w:shd w:val="clear" w:color="auto" w:fill="1E3A5F"/>
             <w:tcMar>
               <w:top w:w="80" w:type="dxa"/>
               <w:bottom w:w="80" w:type="dxa"/>
@@ -7789,12 +7894,12 @@
         <w:tc>
           <w:tcPr>
             <w:tcW w:type="dxa" w:w="9638"/>
-            <w:shd w:val="clear" w:color="auto" w:fill="E6F5F4"/>
+            <w:shd w:val="clear" w:color="auto" w:fill="F7F9FC"/>
             <w:tcBorders>
               <w:top w:val="nil"/>
               <w:bottom w:val="nil"/>
               <w:right w:val="nil"/>
-              <w:left w:val="single" w:sz="36" w:color="00A19A"/>
+              <w:left w:val="single" w:sz="36" w:color="1E3A5F"/>
             </w:tcBorders>
             <w:tcMar>
               <w:top w:w="140" w:type="dxa"/>
@@ -7807,7 +7912,7 @@
             <w:r>
               <w:rPr>
                 <w:b/>
-                <w:color w:val="16325C"/>
+                <w:color w:val="1E3A5F"/>
                 <w:sz w:val="22"/>
               </w:rPr>
               <w:t>Looking after yourself</w:t>
@@ -7827,9 +7932,9 @@
               <w:rPr>
                 <w:b/>
                 <w:i w:val="0"/>
-                <w:color w:val="8A5A00"/>
+                <w:color w:val="6B4E00"/>
                 <w:sz w:val="20"/>
-                <w:shd w:val="clear" w:color="auto" w:fill="FFF4D6"/>
+                <w:shd w:val="clear" w:color="auto" w:fill="FFF2A8"/>
               </w:rPr>
               <w:t>[If IWS offers an Employee Assistance Program, add the provider and number here.]</w:t>
             </w:r>
@@ -7864,7 +7969,7 @@
         <w:tc>
           <w:tcPr>
             <w:tcW w:type="dxa" w:w="794"/>
-            <w:shd w:val="clear" w:color="auto" w:fill="00A19A"/>
+            <w:shd w:val="clear" w:color="auto" w:fill="E07A2E"/>
             <w:tcMar>
               <w:top w:w="120" w:type="dxa"/>
               <w:bottom w:w="120" w:type="dxa"/>
@@ -7891,7 +7996,7 @@
         <w:tc>
           <w:tcPr>
             <w:tcW w:type="dxa" w:w="8844"/>
-            <w:shd w:val="clear" w:color="auto" w:fill="16325C"/>
+            <w:shd w:val="clear" w:color="auto" w:fill="1E3A5F"/>
             <w:tcMar>
               <w:top w:w="120" w:type="dxa"/>
               <w:bottom w:w="120" w:type="dxa"/>
@@ -7923,20 +8028,20 @@
         <w:jc w:val="center"/>
         <w:tblLook w:firstColumn="1" w:firstRow="1" w:lastColumn="0" w:lastRow="0" w:noHBand="0" w:noVBand="1" w:val="04A0"/>
         <w:tblBorders>
-          <w:top w:val="single" w:sz="4" w:color="D5DDE2"/>
-          <w:left w:val="single" w:sz="4" w:color="D5DDE2"/>
-          <w:bottom w:val="single" w:sz="4" w:color="D5DDE2"/>
-          <w:right w:val="single" w:sz="4" w:color="D5DDE2"/>
-          <w:insideH w:val="single" w:sz="4" w:color="D5DDE2"/>
-          <w:insideV w:val="single" w:sz="4" w:color="D5DDE2"/>
+          <w:top w:val="single" w:sz="4" w:color="E3E8EF"/>
+          <w:left w:val="single" w:sz="4" w:color="E3E8EF"/>
+          <w:bottom w:val="single" w:sz="4" w:color="E3E8EF"/>
+          <w:right w:val="single" w:sz="4" w:color="E3E8EF"/>
+          <w:insideH w:val="single" w:sz="4" w:color="E3E8EF"/>
+          <w:insideV w:val="single" w:sz="4" w:color="E3E8EF"/>
         </w:tblBorders>
         <w:tblW w:w="9639" w:type="dxa"/>
         <w:tblLayout w:type="fixed"/>
       </w:tblPr>
       <w:tblGrid>
-        <w:gridCol w:w="2041"/>
-        <w:gridCol w:w="4195"/>
+        <w:gridCol w:w="1814"/>
         <w:gridCol w:w="3402"/>
+        <w:gridCol w:w="4422"/>
       </w:tblGrid>
       <w:tr>
         <w:trPr>
@@ -7944,8 +8049,8 @@
         </w:trPr>
         <w:tc>
           <w:tcPr>
-            <w:tcW w:type="dxa" w:w="2041"/>
-            <w:shd w:val="clear" w:color="auto" w:fill="16325C"/>
+            <w:tcW w:type="dxa" w:w="1814"/>
+            <w:shd w:val="clear" w:color="auto" w:fill="1E3A5F"/>
             <w:tcMar>
               <w:top w:w="90" w:type="dxa"/>
               <w:bottom w:w="90" w:type="dxa"/>
@@ -7966,8 +8071,8 @@
         </w:tc>
         <w:tc>
           <w:tcPr>
-            <w:tcW w:type="dxa" w:w="4195"/>
-            <w:shd w:val="clear" w:color="auto" w:fill="16325C"/>
+            <w:tcW w:type="dxa" w:w="3402"/>
+            <w:shd w:val="clear" w:color="auto" w:fill="1E3A5F"/>
             <w:tcMar>
               <w:top w:w="90" w:type="dxa"/>
               <w:bottom w:w="90" w:type="dxa"/>
@@ -7988,8 +8093,8 @@
         </w:tc>
         <w:tc>
           <w:tcPr>
-            <w:tcW w:type="dxa" w:w="3402"/>
-            <w:shd w:val="clear" w:color="auto" w:fill="16325C"/>
+            <w:tcW w:type="dxa" w:w="4422"/>
+            <w:shd w:val="clear" w:color="auto" w:fill="1E3A5F"/>
             <w:tcMar>
               <w:top w:w="90" w:type="dxa"/>
               <w:bottom w:w="90" w:type="dxa"/>
@@ -8015,7 +8120,7 @@
         </w:trPr>
         <w:tc>
           <w:tcPr>
-            <w:tcW w:type="dxa" w:w="2041"/>
+            <w:tcW w:type="dxa" w:w="1814"/>
             <w:tcMar>
               <w:top w:w="80" w:type="dxa"/>
               <w:bottom w:w="80" w:type="dxa"/>
@@ -8040,7 +8145,7 @@
         </w:tc>
         <w:tc>
           <w:tcPr>
-            <w:tcW w:type="dxa" w:w="4195"/>
+            <w:tcW w:type="dxa" w:w="3402"/>
             <w:tcMar>
               <w:top w:w="80" w:type="dxa"/>
               <w:bottom w:w="80" w:type="dxa"/>
@@ -8065,7 +8170,7 @@
         </w:tc>
         <w:tc>
           <w:tcPr>
-            <w:tcW w:type="dxa" w:w="3402"/>
+            <w:tcW w:type="dxa" w:w="4422"/>
             <w:tcMar>
               <w:top w:w="80" w:type="dxa"/>
               <w:bottom w:w="80" w:type="dxa"/>
@@ -8095,7 +8200,7 @@
         </w:trPr>
         <w:tc>
           <w:tcPr>
-            <w:tcW w:type="dxa" w:w="2041"/>
+            <w:tcW w:type="dxa" w:w="1814"/>
             <w:tcMar>
               <w:top w:w="80" w:type="dxa"/>
               <w:bottom w:w="80" w:type="dxa"/>
@@ -8121,7 +8226,7 @@
         </w:tc>
         <w:tc>
           <w:tcPr>
-            <w:tcW w:type="dxa" w:w="4195"/>
+            <w:tcW w:type="dxa" w:w="3402"/>
             <w:tcMar>
               <w:top w:w="80" w:type="dxa"/>
               <w:bottom w:w="80" w:type="dxa"/>
@@ -8147,7 +8252,7 @@
         </w:tc>
         <w:tc>
           <w:tcPr>
-            <w:tcW w:type="dxa" w:w="3402"/>
+            <w:tcW w:type="dxa" w:w="4422"/>
             <w:tcMar>
               <w:top w:w="80" w:type="dxa"/>
               <w:bottom w:w="80" w:type="dxa"/>
@@ -8164,9 +8269,9 @@
               <w:rPr>
                 <w:b/>
                 <w:i w:val="0"/>
-                <w:color w:val="8A5A00"/>
+                <w:color w:val="6B4E00"/>
                 <w:sz w:val="19"/>
-                <w:shd w:val="clear" w:color="auto" w:fill="FFF4D6"/>
+                <w:shd w:val="clear" w:color="auto" w:fill="FFF2A8"/>
               </w:rPr>
               <w:t>[On-call phone, hours]</w:t>
             </w:r>
@@ -8179,7 +8284,7 @@
         </w:trPr>
         <w:tc>
           <w:tcPr>
-            <w:tcW w:type="dxa" w:w="2041"/>
+            <w:tcW w:type="dxa" w:w="1814"/>
             <w:tcMar>
               <w:top w:w="80" w:type="dxa"/>
               <w:bottom w:w="80" w:type="dxa"/>
@@ -8204,7 +8309,7 @@
         </w:tc>
         <w:tc>
           <w:tcPr>
-            <w:tcW w:type="dxa" w:w="4195"/>
+            <w:tcW w:type="dxa" w:w="3402"/>
             <w:tcMar>
               <w:top w:w="80" w:type="dxa"/>
               <w:bottom w:w="80" w:type="dxa"/>
@@ -8229,7 +8334,7 @@
         </w:tc>
         <w:tc>
           <w:tcPr>
-            <w:tcW w:type="dxa" w:w="3402"/>
+            <w:tcW w:type="dxa" w:w="4422"/>
             <w:tcMar>
               <w:top w:w="80" w:type="dxa"/>
               <w:bottom w:w="80" w:type="dxa"/>
@@ -8243,32 +8348,14 @@
             </w:pPr>
             <w:r>
               <w:rPr>
-                <w:b/>
-                <w:i w:val="0"/>
-                <w:color w:val="8A5A00"/>
-                <w:sz w:val="19"/>
-                <w:shd w:val="clear" w:color="auto" w:fill="FFF4D6"/>
-              </w:rPr>
-              <w:t>[Office phone]</w:t>
-            </w:r>
-            <w:r>
-              <w:rPr>
                 <w:b w:val="0"/>
                 <w:i w:val="0"/>
                 <w:color w:val="1F2933"/>
                 <w:sz w:val="19"/>
               </w:rPr>
-              <w:t xml:space="preserve">  |  </w:t>
-            </w:r>
-            <w:r>
-              <w:rPr>
-                <w:b/>
-                <w:i w:val="0"/>
-                <w:color w:val="8A5A00"/>
-                <w:sz w:val="19"/>
-                <w:shd w:val="clear" w:color="auto" w:fill="FFF4D6"/>
-              </w:rPr>
-              <w:t>[Office email]</w:t>
+              <w:t>+61 493 716 007</w:t>
+              <w:br/>
+              <w:t>michael.sibanda@interactivews.com</w:t>
             </w:r>
           </w:p>
         </w:tc>
@@ -8279,7 +8366,7 @@
         </w:trPr>
         <w:tc>
           <w:tcPr>
-            <w:tcW w:type="dxa" w:w="2041"/>
+            <w:tcW w:type="dxa" w:w="1814"/>
             <w:tcMar>
               <w:top w:w="80" w:type="dxa"/>
               <w:bottom w:w="80" w:type="dxa"/>
@@ -8305,7 +8392,7 @@
         </w:tc>
         <w:tc>
           <w:tcPr>
-            <w:tcW w:type="dxa" w:w="4195"/>
+            <w:tcW w:type="dxa" w:w="3402"/>
             <w:tcMar>
               <w:top w:w="80" w:type="dxa"/>
               <w:bottom w:w="80" w:type="dxa"/>
@@ -8331,7 +8418,7 @@
         </w:tc>
         <w:tc>
           <w:tcPr>
-            <w:tcW w:type="dxa" w:w="3402"/>
+            <w:tcW w:type="dxa" w:w="4422"/>
             <w:tcMar>
               <w:top w:w="80" w:type="dxa"/>
               <w:bottom w:w="80" w:type="dxa"/>
@@ -8346,13 +8433,12 @@
             </w:pPr>
             <w:r>
               <w:rPr>
-                <w:b/>
+                <w:b w:val="0"/>
                 <w:i w:val="0"/>
-                <w:color w:val="8A5A00"/>
+                <w:color w:val="1F2933"/>
                 <w:sz w:val="19"/>
-                <w:shd w:val="clear" w:color="auto" w:fill="FFF4D6"/>
               </w:rPr>
-              <w:t>[Payroll email]</w:t>
+              <w:t>michael.sibanda@interactivews.com</w:t>
             </w:r>
           </w:p>
         </w:tc>
@@ -8363,7 +8449,7 @@
         </w:trPr>
         <w:tc>
           <w:tcPr>
-            <w:tcW w:type="dxa" w:w="2041"/>
+            <w:tcW w:type="dxa" w:w="1814"/>
             <w:tcMar>
               <w:top w:w="80" w:type="dxa"/>
               <w:bottom w:w="80" w:type="dxa"/>
@@ -8388,7 +8474,7 @@
         </w:tc>
         <w:tc>
           <w:tcPr>
-            <w:tcW w:type="dxa" w:w="4195"/>
+            <w:tcW w:type="dxa" w:w="3402"/>
             <w:tcMar>
               <w:top w:w="80" w:type="dxa"/>
               <w:bottom w:w="80" w:type="dxa"/>
@@ -8413,7 +8499,7 @@
         </w:tc>
         <w:tc>
           <w:tcPr>
-            <w:tcW w:type="dxa" w:w="3402"/>
+            <w:tcW w:type="dxa" w:w="4422"/>
             <w:tcMar>
               <w:top w:w="80" w:type="dxa"/>
               <w:bottom w:w="80" w:type="dxa"/>
@@ -8432,17 +8518,9 @@
                 <w:color w:val="1F2933"/>
                 <w:sz w:val="19"/>
               </w:rPr>
-              <w:t xml:space="preserve">Michael Sibanda  |  </w:t>
-            </w:r>
-            <w:r>
-              <w:rPr>
-                <w:b/>
-                <w:i w:val="0"/>
-                <w:color w:val="8A5A00"/>
-                <w:sz w:val="19"/>
-                <w:shd w:val="clear" w:color="auto" w:fill="FFF4D6"/>
-              </w:rPr>
-              <w:t>[Director email]</w:t>
+              <w:t>Michael Sibanda</w:t>
+              <w:br/>
+              <w:t>michael.sibanda@interactivews.com</w:t>
             </w:r>
           </w:p>
         </w:tc>
@@ -8453,7 +8531,7 @@
         </w:trPr>
         <w:tc>
           <w:tcPr>
-            <w:tcW w:type="dxa" w:w="2041"/>
+            <w:tcW w:type="dxa" w:w="1814"/>
             <w:tcMar>
               <w:top w:w="80" w:type="dxa"/>
               <w:bottom w:w="80" w:type="dxa"/>
@@ -8479,7 +8557,7 @@
         </w:tc>
         <w:tc>
           <w:tcPr>
-            <w:tcW w:type="dxa" w:w="4195"/>
+            <w:tcW w:type="dxa" w:w="3402"/>
             <w:tcMar>
               <w:top w:w="80" w:type="dxa"/>
               <w:bottom w:w="80" w:type="dxa"/>
@@ -8505,7 +8583,7 @@
         </w:tc>
         <w:tc>
           <w:tcPr>
-            <w:tcW w:type="dxa" w:w="3402"/>
+            <w:tcW w:type="dxa" w:w="4422"/>
             <w:tcMar>
               <w:top w:w="80" w:type="dxa"/>
               <w:bottom w:w="80" w:type="dxa"/>
@@ -8536,7 +8614,7 @@
         </w:trPr>
         <w:tc>
           <w:tcPr>
-            <w:tcW w:type="dxa" w:w="2041"/>
+            <w:tcW w:type="dxa" w:w="1814"/>
             <w:tcMar>
               <w:top w:w="80" w:type="dxa"/>
               <w:bottom w:w="80" w:type="dxa"/>
@@ -8561,7 +8639,7 @@
         </w:tc>
         <w:tc>
           <w:tcPr>
-            <w:tcW w:type="dxa" w:w="4195"/>
+            <w:tcW w:type="dxa" w:w="3402"/>
             <w:tcMar>
               <w:top w:w="80" w:type="dxa"/>
               <w:bottom w:w="80" w:type="dxa"/>
@@ -8586,7 +8664,7 @@
         </w:tc>
         <w:tc>
           <w:tcPr>
-            <w:tcW w:type="dxa" w:w="3402"/>
+            <w:tcW w:type="dxa" w:w="4422"/>
             <w:tcMar>
               <w:top w:w="80" w:type="dxa"/>
               <w:bottom w:w="80" w:type="dxa"/>
@@ -8616,7 +8694,7 @@
         </w:trPr>
         <w:tc>
           <w:tcPr>
-            <w:tcW w:type="dxa" w:w="2041"/>
+            <w:tcW w:type="dxa" w:w="1814"/>
             <w:tcMar>
               <w:top w:w="80" w:type="dxa"/>
               <w:bottom w:w="80" w:type="dxa"/>
@@ -8642,7 +8720,7 @@
         </w:tc>
         <w:tc>
           <w:tcPr>
-            <w:tcW w:type="dxa" w:w="4195"/>
+            <w:tcW w:type="dxa" w:w="3402"/>
             <w:tcMar>
               <w:top w:w="80" w:type="dxa"/>
               <w:bottom w:w="80" w:type="dxa"/>
@@ -8668,7 +8746,7 @@
         </w:tc>
         <w:tc>
           <w:tcPr>
-            <w:tcW w:type="dxa" w:w="3402"/>
+            <w:tcW w:type="dxa" w:w="4422"/>
             <w:tcMar>
               <w:top w:w="80" w:type="dxa"/>
               <w:bottom w:w="80" w:type="dxa"/>
@@ -8723,12 +8801,12 @@
         <w:tc>
           <w:tcPr>
             <w:tcW w:type="dxa" w:w="9638"/>
-            <w:shd w:val="clear" w:color="auto" w:fill="E6F5F4"/>
+            <w:shd w:val="clear" w:color="auto" w:fill="F7F9FC"/>
             <w:tcBorders>
               <w:top w:val="nil"/>
               <w:bottom w:val="nil"/>
               <w:right w:val="nil"/>
-              <w:left w:val="single" w:sz="36" w:color="00A19A"/>
+              <w:left w:val="single" w:sz="36" w:color="1E3A5F"/>
             </w:tcBorders>
             <w:tcMar>
               <w:top w:w="140" w:type="dxa"/>
@@ -8741,7 +8819,7 @@
             <w:r>
               <w:rPr>
                 <w:b/>
-                <w:color w:val="16325C"/>
+                <w:color w:val="1E3A5F"/>
                 <w:sz w:val="22"/>
               </w:rPr>
               <w:t>Save these two numbers now</w:t>
@@ -8770,9 +8848,9 @@
               <w:rPr>
                 <w:b/>
                 <w:i w:val="0"/>
-                <w:color w:val="8A5A00"/>
+                <w:color w:val="6B4E00"/>
                 <w:sz w:val="20"/>
-                <w:shd w:val="clear" w:color="auto" w:fill="FFF4D6"/>
+                <w:shd w:val="clear" w:color="auto" w:fill="FFF2A8"/>
               </w:rPr>
               <w:t>[On-call phone]</w:t>
             </w:r>
@@ -8834,7 +8912,7 @@
         <w:tc>
           <w:tcPr>
             <w:tcW w:type="dxa" w:w="794"/>
-            <w:shd w:val="clear" w:color="auto" w:fill="00A19A"/>
+            <w:shd w:val="clear" w:color="auto" w:fill="E07A2E"/>
             <w:tcMar>
               <w:top w:w="120" w:type="dxa"/>
               <w:bottom w:w="120" w:type="dxa"/>
@@ -8861,7 +8939,7 @@
         <w:tc>
           <w:tcPr>
             <w:tcW w:type="dxa" w:w="8844"/>
-            <w:shd w:val="clear" w:color="auto" w:fill="16325C"/>
+            <w:shd w:val="clear" w:color="auto" w:fill="1E3A5F"/>
             <w:tcMar>
               <w:top w:w="120" w:type="dxa"/>
               <w:bottom w:w="120" w:type="dxa"/>
@@ -8918,7 +8996,7 @@
       <w:r>
         <w:rPr>
           <w:b/>
-          <w:color w:val="16325C"/>
+          <w:color w:val="1E3A5F"/>
         </w:rPr>
         <w:t xml:space="preserve">☐  </w:t>
       </w:r>
@@ -8940,7 +9018,7 @@
       <w:r>
         <w:rPr>
           <w:b/>
-          <w:color w:val="16325C"/>
+          <w:color w:val="1E3A5F"/>
         </w:rPr>
         <w:t xml:space="preserve">☐  </w:t>
       </w:r>
@@ -8962,7 +9040,7 @@
       <w:r>
         <w:rPr>
           <w:b/>
-          <w:color w:val="16325C"/>
+          <w:color w:val="1E3A5F"/>
         </w:rPr>
         <w:t xml:space="preserve">☐  </w:t>
       </w:r>
@@ -8984,7 +9062,7 @@
       <w:r>
         <w:rPr>
           <w:b/>
-          <w:color w:val="16325C"/>
+          <w:color w:val="1E3A5F"/>
         </w:rPr>
         <w:t xml:space="preserve">☐  </w:t>
       </w:r>
@@ -9006,7 +9084,7 @@
       <w:r>
         <w:rPr>
           <w:b/>
-          <w:color w:val="16325C"/>
+          <w:color w:val="1E3A5F"/>
         </w:rPr>
         <w:t xml:space="preserve">☐  </w:t>
       </w:r>
@@ -9028,7 +9106,7 @@
       <w:r>
         <w:rPr>
           <w:b/>
-          <w:color w:val="16325C"/>
+          <w:color w:val="1E3A5F"/>
         </w:rPr>
         <w:t xml:space="preserve">☐  </w:t>
       </w:r>
@@ -9050,7 +9128,7 @@
       <w:r>
         <w:rPr>
           <w:b/>
-          <w:color w:val="16325C"/>
+          <w:color w:val="1E3A5F"/>
         </w:rPr>
         <w:t xml:space="preserve">☐  </w:t>
       </w:r>
@@ -9079,12 +9157,12 @@
       <w:tblPr>
         <w:tblLook w:firstColumn="1" w:firstRow="1" w:lastColumn="0" w:lastRow="0" w:noHBand="0" w:noVBand="1" w:val="04A0"/>
         <w:tblBorders>
-          <w:top w:val="single" w:sz="4" w:color="D5DDE2"/>
-          <w:left w:val="single" w:sz="4" w:color="D5DDE2"/>
-          <w:bottom w:val="single" w:sz="4" w:color="D5DDE2"/>
-          <w:right w:val="single" w:sz="4" w:color="D5DDE2"/>
-          <w:insideH w:val="single" w:sz="4" w:color="D5DDE2"/>
-          <w:insideV w:val="single" w:sz="4" w:color="D5DDE2"/>
+          <w:top w:val="single" w:sz="4" w:color="E3E8EF"/>
+          <w:left w:val="single" w:sz="4" w:color="E3E8EF"/>
+          <w:bottom w:val="single" w:sz="4" w:color="E3E8EF"/>
+          <w:right w:val="single" w:sz="4" w:color="E3E8EF"/>
+          <w:insideH w:val="single" w:sz="4" w:color="E3E8EF"/>
+          <w:insideV w:val="single" w:sz="4" w:color="E3E8EF"/>
         </w:tblBorders>
         <w:tblW w:w="9639" w:type="dxa"/>
         <w:tblLayout w:type="fixed"/>
@@ -9100,7 +9178,7 @@
         <w:tc>
           <w:tcPr>
             <w:tcW w:type="dxa" w:w="3118"/>
-            <w:shd w:val="clear" w:color="auto" w:fill="E6F5F4"/>
+            <w:shd w:val="clear" w:color="auto" w:fill="F7F9FC"/>
             <w:tcMar>
               <w:top w:w="180" w:type="dxa"/>
               <w:bottom w:w="180" w:type="dxa"/>
@@ -9112,7 +9190,7 @@
             <w:r>
               <w:rPr>
                 <w:b/>
-                <w:color w:val="16325C"/>
+                <w:color w:val="1E3A5F"/>
                 <w:sz w:val="20"/>
               </w:rPr>
               <w:t>Full name</w:t>
@@ -9139,7 +9217,7 @@
         <w:tc>
           <w:tcPr>
             <w:tcW w:type="dxa" w:w="3118"/>
-            <w:shd w:val="clear" w:color="auto" w:fill="E6F5F4"/>
+            <w:shd w:val="clear" w:color="auto" w:fill="F7F9FC"/>
             <w:tcMar>
               <w:top w:w="180" w:type="dxa"/>
               <w:bottom w:w="180" w:type="dxa"/>
@@ -9151,7 +9229,7 @@
             <w:r>
               <w:rPr>
                 <w:b/>
-                <w:color w:val="16325C"/>
+                <w:color w:val="1E3A5F"/>
                 <w:sz w:val="20"/>
               </w:rPr>
               <w:t>Signature</w:t>
@@ -9178,7 +9256,7 @@
         <w:tc>
           <w:tcPr>
             <w:tcW w:type="dxa" w:w="3118"/>
-            <w:shd w:val="clear" w:color="auto" w:fill="E6F5F4"/>
+            <w:shd w:val="clear" w:color="auto" w:fill="F7F9FC"/>
             <w:tcMar>
               <w:top w:w="180" w:type="dxa"/>
               <w:bottom w:w="180" w:type="dxa"/>
@@ -9190,7 +9268,7 @@
             <w:r>
               <w:rPr>
                 <w:b/>
-                <w:color w:val="16325C"/>
+                <w:color w:val="1E3A5F"/>
                 <w:sz w:val="20"/>
               </w:rPr>
               <w:t>Date</w:t>
@@ -9217,7 +9295,7 @@
         <w:tc>
           <w:tcPr>
             <w:tcW w:type="dxa" w:w="3118"/>
-            <w:shd w:val="clear" w:color="auto" w:fill="E6F5F4"/>
+            <w:shd w:val="clear" w:color="auto" w:fill="F7F9FC"/>
             <w:tcMar>
               <w:top w:w="180" w:type="dxa"/>
               <w:bottom w:w="180" w:type="dxa"/>
@@ -9229,7 +9307,7 @@
             <w:r>
               <w:rPr>
                 <w:b/>
-                <w:color w:val="16325C"/>
+                <w:color w:val="1E3A5F"/>
                 <w:sz w:val="20"/>
               </w:rPr>
               <w:t>IWS representative</w:t>
@@ -9256,7 +9334,7 @@
         <w:tc>
           <w:tcPr>
             <w:tcW w:type="dxa" w:w="3118"/>
-            <w:shd w:val="clear" w:color="auto" w:fill="E6F5F4"/>
+            <w:shd w:val="clear" w:color="auto" w:fill="F7F9FC"/>
             <w:tcMar>
               <w:top w:w="180" w:type="dxa"/>
               <w:bottom w:w="180" w:type="dxa"/>
@@ -9268,7 +9346,7 @@
             <w:r>
               <w:rPr>
                 <w:b/>
-                <w:color w:val="16325C"/>
+                <w:color w:val="1E3A5F"/>
                 <w:sz w:val="20"/>
               </w:rPr>
               <w:t>IWS signature and date</w:t>
@@ -9290,8 +9368,8 @@
       </w:tr>
     </w:tbl>
     <w:sectPr>
-      <w:headerReference w:type="default" r:id="rId9"/>
-      <w:footerReference w:type="default" r:id="rId10"/>
+      <w:headerReference w:type="default" r:id="rId10"/>
+      <w:footerReference w:type="default" r:id="rId11"/>
       <w:pgSz w:w="11906" w:h="16838"/>
       <w:pgMar w:top="907" w:right="1134" w:bottom="907" w:left="1134" w:header="720" w:footer="720" w:gutter="0"/>
       <w:cols w:space="720"/>
@@ -9307,17 +9385,33 @@
   <w:p>
     <w:pPr>
       <w:pStyle w:val="Footer"/>
+      <w:tabs>
+        <w:tab w:pos="9581" w:val="right"/>
+      </w:tabs>
+      <w:pBdr>
+        <w:top w:val="single" w:sz="4" w:color="E3E8EF" w:space="6"/>
+      </w:pBdr>
     </w:pPr>
     <w:r>
       <w:rPr>
         <w:color w:val="5B6770"/>
-        <w:sz w:val="17"/>
-      </w:rPr>
-      <w:t xml:space="preserve">Interactive Workforce Solutions  |  Worker Welcome Pack  |  Page </w:t>
+        <w:sz w:val="16"/>
+      </w:rPr>
+      <w:t>Interactive Workforce Solutions  ·  ABN 15 373 790 652  ·  michael.sibanda@interactivews.com  ·  +61 493 716 007</w:t>
     </w:r>
     <w:r>
       <w:rPr>
-        <w:color w:val="5B6770"/>
+        <w:b/>
+        <w:color w:val="C07034"/>
+        <w:sz w:val="17"/>
+      </w:rPr>
+      <w:tab/>
+      <w:t xml:space="preserve">Page </w:t>
+    </w:r>
+    <w:r>
+      <w:rPr>
+        <w:b/>
+        <w:color w:val="C07034"/>
         <w:sz w:val="17"/>
       </w:rPr>
       <w:fldChar w:fldCharType="begin"/>
@@ -9331,29 +9425,180 @@
 
 <file path=word/header1.xml><?xml version="1.0" encoding="utf-8"?>
 <w:hdr xmlns:m="http://schemas.openxmlformats.org/officeDocument/2006/math" xmlns:mc="http://schemas.openxmlformats.org/markup-compatibility/2006" xmlns:mo="http://schemas.microsoft.com/office/mac/office/2008/main" xmlns:mv="urn:schemas-microsoft-com:mac:vml" xmlns:o="urn:schemas-microsoft-com:office:office" xmlns:r="http://schemas.openxmlformats.org/officeDocument/2006/relationships" xmlns:v="urn:schemas-microsoft-com:vml" xmlns:w10="urn:schemas-microsoft-com:office:word" xmlns:w14="http://schemas.microsoft.com/office/word/2010/wordml" xmlns:w="http://schemas.openxmlformats.org/wordprocessingml/2006/main" xmlns:wne="http://schemas.microsoft.com/office/word/2006/wordml" xmlns:wp14="http://schemas.microsoft.com/office/word/2010/wordprocessingDrawing" xmlns:wp="http://schemas.openxmlformats.org/drawingml/2006/wordprocessingDrawing" xmlns:wpc="http://schemas.microsoft.com/office/word/2010/wordprocessingCanvas" xmlns:wpg="http://schemas.microsoft.com/office/word/2010/wordprocessingGroup" xmlns:wpi="http://schemas.microsoft.com/office/word/2010/wordprocessingInk" xmlns:wps="http://schemas.microsoft.com/office/word/2010/wordprocessingShape" mc:Ignorable="w14 wp14">
+  <w:tbl>
+    <w:tblPr>
+      <w:tblLook w:firstColumn="1" w:firstRow="1" w:lastColumn="0" w:lastRow="0" w:noHBand="0" w:noVBand="1" w:val="04A0"/>
+      <w:tblBorders>
+        <w:top w:val="nil" w:sz="0" w:color="FFFFFF"/>
+        <w:left w:val="nil" w:sz="0" w:color="FFFFFF"/>
+        <w:bottom w:val="nil" w:sz="0" w:color="FFFFFF"/>
+        <w:right w:val="nil" w:sz="0" w:color="FFFFFF"/>
+        <w:insideH w:val="nil"/>
+        <w:insideV w:val="nil"/>
+      </w:tblBorders>
+      <w:tblW w:w="9639" w:type="dxa"/>
+      <w:tblLayout w:type="fixed"/>
+    </w:tblPr>
+    <w:tblGrid>
+      <w:gridCol w:w="7030"/>
+      <w:gridCol w:w="2608"/>
+    </w:tblGrid>
+    <w:tr>
+      <w:tc>
+        <w:tcPr>
+          <w:tcW w:type="dxa" w:w="7030"/>
+          <w:shd w:val="clear" w:color="auto" w:fill="1E3A5F"/>
+          <w:tcMar>
+            <w:top w:w="0" w:type="dxa"/>
+            <w:bottom w:w="0" w:type="dxa"/>
+            <w:start w:w="0" w:type="dxa"/>
+            <w:end w:w="0" w:type="dxa"/>
+          </w:tcMar>
+        </w:tcPr>
+        <w:p>
+          <w:pPr>
+            <w:spacing w:after="0" w:line="60" w:lineRule="exact"/>
+          </w:pPr>
+          <w:r>
+            <w:rPr>
+              <w:sz w:val="2"/>
+            </w:rPr>
+          </w:r>
+        </w:p>
+      </w:tc>
+      <w:tc>
+        <w:tcPr>
+          <w:tcW w:type="dxa" w:w="2608"/>
+          <w:shd w:val="clear" w:color="auto" w:fill="E07A2E"/>
+          <w:tcMar>
+            <w:top w:w="0" w:type="dxa"/>
+            <w:bottom w:w="0" w:type="dxa"/>
+            <w:start w:w="0" w:type="dxa"/>
+            <w:end w:w="0" w:type="dxa"/>
+          </w:tcMar>
+        </w:tcPr>
+        <w:p>
+          <w:pPr>
+            <w:spacing w:after="0" w:line="60" w:lineRule="exact"/>
+          </w:pPr>
+          <w:r>
+            <w:rPr>
+              <w:sz w:val="2"/>
+            </w:rPr>
+          </w:r>
+        </w:p>
+      </w:tc>
+    </w:tr>
+  </w:tbl>
+  <w:tbl>
+    <w:tblPr>
+      <w:tblLook w:firstColumn="1" w:firstRow="1" w:lastColumn="0" w:lastRow="0" w:noHBand="0" w:noVBand="1" w:val="04A0"/>
+      <w:tblBorders>
+        <w:top w:val="nil" w:sz="0" w:color="FFFFFF"/>
+        <w:left w:val="nil" w:sz="0" w:color="FFFFFF"/>
+        <w:bottom w:val="nil" w:sz="0" w:color="FFFFFF"/>
+        <w:right w:val="nil" w:sz="0" w:color="FFFFFF"/>
+        <w:insideH w:val="nil"/>
+        <w:insideV w:val="nil"/>
+      </w:tblBorders>
+      <w:tblW w:w="9639" w:type="dxa"/>
+      <w:tblLayout w:type="fixed"/>
+    </w:tblPr>
+    <w:tblGrid>
+      <w:gridCol w:w="5103"/>
+      <w:gridCol w:w="4536"/>
+    </w:tblGrid>
+    <w:tr>
+      <w:tc>
+        <w:tcPr>
+          <w:tcW w:type="dxa" w:w="5102"/>
+          <w:tcMar>
+            <w:top w:w="100" w:type="dxa"/>
+            <w:bottom w:w="60" w:type="dxa"/>
+            <w:start w:w="0" w:type="dxa"/>
+            <w:end w:w="0" w:type="dxa"/>
+          </w:tcMar>
+          <w:vAlign w:val="center"/>
+        </w:tcPr>
+        <w:p>
+          <w:pPr>
+            <w:spacing w:after="0"/>
+          </w:pPr>
+          <w:r>
+            <w:drawing>
+              <wp:inline xmlns:a="http://schemas.openxmlformats.org/drawingml/2006/main" xmlns:pic="http://schemas.openxmlformats.org/drawingml/2006/picture">
+                <wp:extent cx="275119" cy="270000"/>
+                <wp:docPr id="1" name="Picture 1"/>
+                <wp:cNvGraphicFramePr>
+                  <a:graphicFrameLocks noChangeAspect="1"/>
+                </wp:cNvGraphicFramePr>
+                <a:graphic>
+                  <a:graphicData uri="http://schemas.openxmlformats.org/drawingml/2006/picture">
+                    <pic:pic>
+                      <pic:nvPicPr>
+                        <pic:cNvPr id="0" name="iws_logo.png"/>
+                        <pic:cNvPicPr/>
+                      </pic:nvPicPr>
+                      <pic:blipFill>
+                        <a:blip r:embed="rId1"/>
+                        <a:stretch>
+                          <a:fillRect/>
+                        </a:stretch>
+                      </pic:blipFill>
+                      <pic:spPr>
+                        <a:xfrm>
+                          <a:off x="0" y="0"/>
+                          <a:ext cx="275119" cy="270000"/>
+                        </a:xfrm>
+                        <a:prstGeom prst="rect"/>
+                      </pic:spPr>
+                    </pic:pic>
+                  </a:graphicData>
+                </a:graphic>
+              </wp:inline>
+            </w:drawing>
+          </w:r>
+          <w:r>
+            <w:rPr>
+              <w:b/>
+              <w:color w:val="1E3A5F"/>
+              <w:sz w:val="19"/>
+            </w:rPr>
+            <w:t xml:space="preserve">  Interactive Workforce Solutions</w:t>
+          </w:r>
+        </w:p>
+      </w:tc>
+      <w:tc>
+        <w:tcPr>
+          <w:tcW w:type="dxa" w:w="4535"/>
+          <w:tcMar>
+            <w:top w:w="100" w:type="dxa"/>
+            <w:bottom w:w="60" w:type="dxa"/>
+            <w:start w:w="0" w:type="dxa"/>
+            <w:end w:w="0" w:type="dxa"/>
+          </w:tcMar>
+          <w:vAlign w:val="center"/>
+        </w:tcPr>
+        <w:p>
+          <w:pPr>
+            <w:spacing w:after="0"/>
+            <w:jc w:val="right"/>
+          </w:pPr>
+          <w:r>
+            <w:rPr>
+              <w:color w:val="5B6770"/>
+              <w:sz w:val="18"/>
+            </w:rPr>
+            <w:t>Welcome Pack: Contractors and Support Workers</w:t>
+          </w:r>
+        </w:p>
+      </w:tc>
+    </w:tr>
+  </w:tbl>
   <w:p>
     <w:pPr>
-      <w:pStyle w:val="Header"/>
-      <w:jc w:val="right"/>
-      <w:pBdr>
-        <w:bottom w:val="single" w:sz="8" w:color="00A19A" w:space="4"/>
-      </w:pBdr>
+      <w:spacing w:after="0"/>
     </w:pPr>
-    <w:r>
-      <w:rPr>
-        <w:b/>
-        <w:color w:val="16325C"/>
-        <w:sz w:val="18"/>
-      </w:rPr>
-      <w:t xml:space="preserve">IWS  </w:t>
-    </w:r>
-    <w:r>
-      <w:rPr>
-        <w:color w:val="5B6770"/>
-        <w:sz w:val="18"/>
-      </w:rPr>
-      <w:t>Welcome Pack: Contractors and Support Workers</w:t>
-    </w:r>
   </w:p>
 </w:hdr>
 </file>
@@ -9725,7 +9970,7 @@
       <w:spacing w:after="120" w:line="276" w:lineRule="auto"/>
     </w:pPr>
     <w:rPr>
-      <w:rFonts w:ascii="Calibri" w:hAnsi="Calibri" w:eastAsia="Calibri"/>
+      <w:rFonts w:ascii="Inter" w:hAnsi="Inter" w:eastAsia="Inter"/>
       <w:color w:val="1F2933"/>
       <w:sz w:val="21"/>
     </w:rPr>
@@ -9789,10 +10034,10 @@
       <w:outlineLvl w:val="0"/>
     </w:pPr>
     <w:rPr>
-      <w:rFonts w:asciiTheme="majorHAnsi" w:eastAsiaTheme="majorEastAsia" w:hAnsiTheme="majorHAnsi" w:cstheme="majorBidi" w:ascii="Calibri" w:hAnsi="Calibri"/>
+      <w:rFonts w:asciiTheme="majorHAnsi" w:eastAsiaTheme="majorEastAsia" w:hAnsiTheme="majorHAnsi" w:cstheme="majorBidi" w:ascii="Inter" w:hAnsi="Inter"/>
       <w:b/>
       <w:bCs/>
-      <w:color w:val="16325C"/>
+      <w:color w:val="1E3A5F"/>
       <w:sz w:val="36"/>
       <w:szCs w:val="28"/>
     </w:rPr>
@@ -9813,10 +10058,10 @@
       <w:outlineLvl w:val="1"/>
     </w:pPr>
     <w:rPr>
-      <w:rFonts w:asciiTheme="majorHAnsi" w:eastAsiaTheme="majorEastAsia" w:hAnsiTheme="majorHAnsi" w:cstheme="majorBidi" w:ascii="Calibri" w:hAnsi="Calibri"/>
+      <w:rFonts w:asciiTheme="majorHAnsi" w:eastAsiaTheme="majorEastAsia" w:hAnsiTheme="majorHAnsi" w:cstheme="majorBidi" w:ascii="Inter" w:hAnsi="Inter"/>
       <w:b/>
       <w:bCs/>
-      <w:color w:val="00A19A"/>
+      <w:color w:val="C07034"/>
       <w:sz w:val="26"/>
       <w:szCs w:val="26"/>
     </w:rPr>

</xml_diff>